<commit_message>
Minor change in Tidsestomater.*
</commit_message>
<xml_diff>
--- a/Documentation/Materiale til brug ved fondsansøgninger/Version 6.0/Tidsestimater.docx
+++ b/Documentation/Materiale til brug ved fondsansøgninger/Version 6.0/Tidsestimater.docx
@@ -411,7 +411,7 @@
       </w:tblPr>
       <w:tblGrid>
         <w:gridCol w:w="850"/>
-        <w:gridCol w:w="7199"/>
+        <w:gridCol w:w="7198"/>
         <w:gridCol w:w="840"/>
         <w:gridCol w:w="749"/>
       </w:tblGrid>
@@ -429,6 +429,7 @@
           <w:p>
             <w:pPr>
               <w:pStyle w:val="Tabelindhold"/>
+              <w:widowControl w:val="false"/>
               <w:bidi w:val="0"/>
               <w:jc w:val="start"/>
               <w:rPr>
@@ -470,7 +471,7 @@
         </w:tc>
         <w:tc>
           <w:tcPr>
-            <w:tcW w:w="7199" w:type="dxa"/>
+            <w:tcW w:w="7198" w:type="dxa"/>
             <w:tcBorders>
               <w:top w:val="single" w:sz="4" w:space="0" w:color="000000"/>
               <w:start w:val="single" w:sz="4" w:space="0" w:color="000000"/>
@@ -480,6 +481,7 @@
           <w:p>
             <w:pPr>
               <w:pStyle w:val="Tabelindhold"/>
+              <w:widowControl w:val="false"/>
               <w:bidi w:val="0"/>
               <w:jc w:val="start"/>
               <w:rPr>
@@ -531,6 +533,7 @@
           <w:p>
             <w:pPr>
               <w:pStyle w:val="Tabelindhold"/>
+              <w:widowControl w:val="false"/>
               <w:bidi w:val="0"/>
               <w:jc w:val="start"/>
               <w:rPr>
@@ -583,6 +586,7 @@
           <w:p>
             <w:pPr>
               <w:pStyle w:val="Tabelindhold"/>
+              <w:widowControl w:val="false"/>
               <w:bidi w:val="0"/>
               <w:jc w:val="start"/>
               <w:rPr>
@@ -636,55 +640,57 @@
           <w:p>
             <w:pPr>
               <w:pStyle w:val="Tabelindhold"/>
-              <w:bidi w:val="0"/>
-              <w:jc w:val="start"/>
-              <w:rPr>
-                <w:rFonts w:ascii="Liberation Serif" w:hAnsi="Liberation Serif"/>
-                <w:b w:val="false"/>
-                <w:b w:val="false"/>
-                <w:bCs w:val="false"/>
-                <w:i w:val="false"/>
-                <w:i w:val="false"/>
-                <w:iCs w:val="false"/>
-                <w:strike w:val="false"/>
-                <w:dstrike w:val="false"/>
-                <w:outline w:val="false"/>
-                <w:shadow w:val="false"/>
-                <w:color w:val="000000"/>
-                <w:sz w:val="20"/>
-                <w:szCs w:val="20"/>
-                <w:u w:val="none"/>
-              </w:rPr>
-            </w:pPr>
-            <w:r>
-              <w:rPr>
-                <w:b w:val="false"/>
-                <w:bCs w:val="false"/>
-                <w:i w:val="false"/>
-                <w:iCs w:val="false"/>
-                <w:strike w:val="false"/>
-                <w:dstrike w:val="false"/>
-                <w:outline w:val="false"/>
-                <w:shadow w:val="false"/>
-                <w:color w:val="000000"/>
-                <w:sz w:val="20"/>
-                <w:szCs w:val="20"/>
-                <w:u w:val="none"/>
-              </w:rPr>
-            </w:r>
-          </w:p>
-        </w:tc>
-        <w:tc>
-          <w:tcPr>
-            <w:tcW w:w="7199" w:type="dxa"/>
-            <w:tcBorders>
-              <w:start w:val="single" w:sz="4" w:space="0" w:color="000000"/>
-              <w:bottom w:val="single" w:sz="4" w:space="0" w:color="000000"/>
-            </w:tcBorders>
-          </w:tcPr>
-          <w:p>
-            <w:pPr>
-              <w:pStyle w:val="Tabelindhold"/>
+              <w:widowControl w:val="false"/>
+              <w:bidi w:val="0"/>
+              <w:jc w:val="start"/>
+              <w:rPr>
+                <w:rFonts w:ascii="Liberation Serif" w:hAnsi="Liberation Serif"/>
+                <w:b w:val="false"/>
+                <w:b w:val="false"/>
+                <w:bCs w:val="false"/>
+                <w:i w:val="false"/>
+                <w:i w:val="false"/>
+                <w:iCs w:val="false"/>
+                <w:strike w:val="false"/>
+                <w:dstrike w:val="false"/>
+                <w:outline w:val="false"/>
+                <w:shadow w:val="false"/>
+                <w:color w:val="000000"/>
+                <w:sz w:val="20"/>
+                <w:szCs w:val="20"/>
+                <w:u w:val="none"/>
+              </w:rPr>
+            </w:pPr>
+            <w:r>
+              <w:rPr>
+                <w:b w:val="false"/>
+                <w:bCs w:val="false"/>
+                <w:i w:val="false"/>
+                <w:iCs w:val="false"/>
+                <w:strike w:val="false"/>
+                <w:dstrike w:val="false"/>
+                <w:outline w:val="false"/>
+                <w:shadow w:val="false"/>
+                <w:color w:val="000000"/>
+                <w:sz w:val="20"/>
+                <w:szCs w:val="20"/>
+                <w:u w:val="none"/>
+              </w:rPr>
+            </w:r>
+          </w:p>
+        </w:tc>
+        <w:tc>
+          <w:tcPr>
+            <w:tcW w:w="7198" w:type="dxa"/>
+            <w:tcBorders>
+              <w:start w:val="single" w:sz="4" w:space="0" w:color="000000"/>
+              <w:bottom w:val="single" w:sz="4" w:space="0" w:color="000000"/>
+            </w:tcBorders>
+          </w:tcPr>
+          <w:p>
+            <w:pPr>
+              <w:pStyle w:val="Tabelindhold"/>
+              <w:widowControl w:val="false"/>
               <w:bidi w:val="0"/>
               <w:jc w:val="start"/>
               <w:rPr>
@@ -735,6 +741,7 @@
           <w:p>
             <w:pPr>
               <w:pStyle w:val="Tabelindhold"/>
+              <w:widowControl w:val="false"/>
               <w:bidi w:val="0"/>
               <w:jc w:val="start"/>
               <w:rPr>
@@ -786,6 +793,7 @@
           <w:p>
             <w:pPr>
               <w:pStyle w:val="Tabelindhold"/>
+              <w:widowControl w:val="false"/>
               <w:bidi w:val="0"/>
               <w:jc w:val="start"/>
               <w:rPr>
@@ -839,55 +847,57 @@
           <w:p>
             <w:pPr>
               <w:pStyle w:val="Tabelindhold"/>
-              <w:bidi w:val="0"/>
-              <w:jc w:val="start"/>
-              <w:rPr>
-                <w:rFonts w:ascii="Liberation Serif" w:hAnsi="Liberation Serif"/>
-                <w:b w:val="false"/>
-                <w:b w:val="false"/>
-                <w:bCs w:val="false"/>
-                <w:i w:val="false"/>
-                <w:i w:val="false"/>
-                <w:iCs w:val="false"/>
-                <w:strike w:val="false"/>
-                <w:dstrike w:val="false"/>
-                <w:outline w:val="false"/>
-                <w:shadow w:val="false"/>
-                <w:color w:val="000000"/>
-                <w:sz w:val="20"/>
-                <w:szCs w:val="20"/>
-                <w:u w:val="none"/>
-              </w:rPr>
-            </w:pPr>
-            <w:r>
-              <w:rPr>
-                <w:b w:val="false"/>
-                <w:bCs w:val="false"/>
-                <w:i w:val="false"/>
-                <w:iCs w:val="false"/>
-                <w:strike w:val="false"/>
-                <w:dstrike w:val="false"/>
-                <w:outline w:val="false"/>
-                <w:shadow w:val="false"/>
-                <w:color w:val="000000"/>
-                <w:sz w:val="20"/>
-                <w:szCs w:val="20"/>
-                <w:u w:val="none"/>
-              </w:rPr>
-            </w:r>
-          </w:p>
-        </w:tc>
-        <w:tc>
-          <w:tcPr>
-            <w:tcW w:w="7199" w:type="dxa"/>
-            <w:tcBorders>
-              <w:start w:val="single" w:sz="4" w:space="0" w:color="000000"/>
-              <w:bottom w:val="single" w:sz="4" w:space="0" w:color="000000"/>
-            </w:tcBorders>
-          </w:tcPr>
-          <w:p>
-            <w:pPr>
-              <w:pStyle w:val="Tabelindhold"/>
+              <w:widowControl w:val="false"/>
+              <w:bidi w:val="0"/>
+              <w:jc w:val="start"/>
+              <w:rPr>
+                <w:rFonts w:ascii="Liberation Serif" w:hAnsi="Liberation Serif"/>
+                <w:b w:val="false"/>
+                <w:b w:val="false"/>
+                <w:bCs w:val="false"/>
+                <w:i w:val="false"/>
+                <w:i w:val="false"/>
+                <w:iCs w:val="false"/>
+                <w:strike w:val="false"/>
+                <w:dstrike w:val="false"/>
+                <w:outline w:val="false"/>
+                <w:shadow w:val="false"/>
+                <w:color w:val="000000"/>
+                <w:sz w:val="20"/>
+                <w:szCs w:val="20"/>
+                <w:u w:val="none"/>
+              </w:rPr>
+            </w:pPr>
+            <w:r>
+              <w:rPr>
+                <w:b w:val="false"/>
+                <w:bCs w:val="false"/>
+                <w:i w:val="false"/>
+                <w:iCs w:val="false"/>
+                <w:strike w:val="false"/>
+                <w:dstrike w:val="false"/>
+                <w:outline w:val="false"/>
+                <w:shadow w:val="false"/>
+                <w:color w:val="000000"/>
+                <w:sz w:val="20"/>
+                <w:szCs w:val="20"/>
+                <w:u w:val="none"/>
+              </w:rPr>
+            </w:r>
+          </w:p>
+        </w:tc>
+        <w:tc>
+          <w:tcPr>
+            <w:tcW w:w="7198" w:type="dxa"/>
+            <w:tcBorders>
+              <w:start w:val="single" w:sz="4" w:space="0" w:color="000000"/>
+              <w:bottom w:val="single" w:sz="4" w:space="0" w:color="000000"/>
+            </w:tcBorders>
+          </w:tcPr>
+          <w:p>
+            <w:pPr>
+              <w:pStyle w:val="Tabelindhold"/>
+              <w:widowControl w:val="false"/>
               <w:bidi w:val="0"/>
               <w:jc w:val="start"/>
               <w:rPr>
@@ -938,6 +948,7 @@
           <w:p>
             <w:pPr>
               <w:pStyle w:val="Tabelindhold"/>
+              <w:widowControl w:val="false"/>
               <w:bidi w:val="0"/>
               <w:jc w:val="start"/>
               <w:rPr>
@@ -989,6 +1000,7 @@
           <w:p>
             <w:pPr>
               <w:pStyle w:val="Tabelindhold"/>
+              <w:widowControl w:val="false"/>
               <w:bidi w:val="0"/>
               <w:jc w:val="start"/>
               <w:rPr>
@@ -1042,55 +1054,57 @@
           <w:p>
             <w:pPr>
               <w:pStyle w:val="Tabelindhold"/>
-              <w:bidi w:val="0"/>
-              <w:jc w:val="start"/>
-              <w:rPr>
-                <w:rFonts w:ascii="Liberation Serif" w:hAnsi="Liberation Serif"/>
-                <w:b w:val="false"/>
-                <w:b w:val="false"/>
-                <w:bCs w:val="false"/>
-                <w:i w:val="false"/>
-                <w:i w:val="false"/>
-                <w:iCs w:val="false"/>
-                <w:strike w:val="false"/>
-                <w:dstrike w:val="false"/>
-                <w:outline w:val="false"/>
-                <w:shadow w:val="false"/>
-                <w:color w:val="000000"/>
-                <w:sz w:val="20"/>
-                <w:szCs w:val="20"/>
-                <w:u w:val="none"/>
-              </w:rPr>
-            </w:pPr>
-            <w:r>
-              <w:rPr>
-                <w:b w:val="false"/>
-                <w:bCs w:val="false"/>
-                <w:i w:val="false"/>
-                <w:iCs w:val="false"/>
-                <w:strike w:val="false"/>
-                <w:dstrike w:val="false"/>
-                <w:outline w:val="false"/>
-                <w:shadow w:val="false"/>
-                <w:color w:val="000000"/>
-                <w:sz w:val="20"/>
-                <w:szCs w:val="20"/>
-                <w:u w:val="none"/>
-              </w:rPr>
-            </w:r>
-          </w:p>
-        </w:tc>
-        <w:tc>
-          <w:tcPr>
-            <w:tcW w:w="7199" w:type="dxa"/>
-            <w:tcBorders>
-              <w:start w:val="single" w:sz="4" w:space="0" w:color="000000"/>
-              <w:bottom w:val="single" w:sz="4" w:space="0" w:color="000000"/>
-            </w:tcBorders>
-          </w:tcPr>
-          <w:p>
-            <w:pPr>
-              <w:pStyle w:val="Tabelindhold"/>
+              <w:widowControl w:val="false"/>
+              <w:bidi w:val="0"/>
+              <w:jc w:val="start"/>
+              <w:rPr>
+                <w:rFonts w:ascii="Liberation Serif" w:hAnsi="Liberation Serif"/>
+                <w:b w:val="false"/>
+                <w:b w:val="false"/>
+                <w:bCs w:val="false"/>
+                <w:i w:val="false"/>
+                <w:i w:val="false"/>
+                <w:iCs w:val="false"/>
+                <w:strike w:val="false"/>
+                <w:dstrike w:val="false"/>
+                <w:outline w:val="false"/>
+                <w:shadow w:val="false"/>
+                <w:color w:val="000000"/>
+                <w:sz w:val="20"/>
+                <w:szCs w:val="20"/>
+                <w:u w:val="none"/>
+              </w:rPr>
+            </w:pPr>
+            <w:r>
+              <w:rPr>
+                <w:b w:val="false"/>
+                <w:bCs w:val="false"/>
+                <w:i w:val="false"/>
+                <w:iCs w:val="false"/>
+                <w:strike w:val="false"/>
+                <w:dstrike w:val="false"/>
+                <w:outline w:val="false"/>
+                <w:shadow w:val="false"/>
+                <w:color w:val="000000"/>
+                <w:sz w:val="20"/>
+                <w:szCs w:val="20"/>
+                <w:u w:val="none"/>
+              </w:rPr>
+            </w:r>
+          </w:p>
+        </w:tc>
+        <w:tc>
+          <w:tcPr>
+            <w:tcW w:w="7198" w:type="dxa"/>
+            <w:tcBorders>
+              <w:start w:val="single" w:sz="4" w:space="0" w:color="000000"/>
+              <w:bottom w:val="single" w:sz="4" w:space="0" w:color="000000"/>
+            </w:tcBorders>
+          </w:tcPr>
+          <w:p>
+            <w:pPr>
+              <w:pStyle w:val="Tabelindhold"/>
+              <w:widowControl w:val="false"/>
               <w:bidi w:val="0"/>
               <w:jc w:val="start"/>
               <w:rPr>
@@ -1141,6 +1155,7 @@
           <w:p>
             <w:pPr>
               <w:pStyle w:val="Tabelindhold"/>
+              <w:widowControl w:val="false"/>
               <w:bidi w:val="0"/>
               <w:jc w:val="start"/>
               <w:rPr>
@@ -1192,6 +1207,7 @@
           <w:p>
             <w:pPr>
               <w:pStyle w:val="Tabelindhold"/>
+              <w:widowControl w:val="false"/>
               <w:bidi w:val="0"/>
               <w:jc w:val="start"/>
               <w:rPr>
@@ -1246,6 +1262,7 @@
           <w:p>
             <w:pPr>
               <w:pStyle w:val="Tabelindhold"/>
+              <w:widowControl w:val="false"/>
               <w:bidi w:val="0"/>
               <w:jc w:val="start"/>
               <w:rPr>
@@ -1287,7 +1304,7 @@
         </w:tc>
         <w:tc>
           <w:tcPr>
-            <w:tcW w:w="7199" w:type="dxa"/>
+            <w:tcW w:w="7198" w:type="dxa"/>
             <w:tcBorders>
               <w:top w:val="single" w:sz="4" w:space="0" w:color="000000"/>
               <w:start w:val="single" w:sz="4" w:space="0" w:color="000000"/>
@@ -1297,6 +1314,7 @@
           <w:p>
             <w:pPr>
               <w:pStyle w:val="Tabelindhold"/>
+              <w:widowControl w:val="false"/>
               <w:bidi w:val="0"/>
               <w:jc w:val="start"/>
               <w:rPr>
@@ -1348,6 +1366,7 @@
           <w:p>
             <w:pPr>
               <w:pStyle w:val="Tabelindhold"/>
+              <w:widowControl w:val="false"/>
               <w:bidi w:val="0"/>
               <w:jc w:val="start"/>
               <w:rPr>
@@ -1400,6 +1419,7 @@
           <w:p>
             <w:pPr>
               <w:pStyle w:val="Tabelindhold"/>
+              <w:widowControl w:val="false"/>
               <w:bidi w:val="0"/>
               <w:jc w:val="start"/>
               <w:rPr>
@@ -1453,6 +1473,7 @@
           <w:p>
             <w:pPr>
               <w:pStyle w:val="Tabelindhold"/>
+              <w:widowControl w:val="false"/>
               <w:bidi w:val="0"/>
               <w:jc w:val="start"/>
               <w:rPr>
@@ -1494,15 +1515,16 @@
         </w:tc>
         <w:tc>
           <w:tcPr>
-            <w:tcW w:w="7199" w:type="dxa"/>
-            <w:tcBorders>
-              <w:start w:val="single" w:sz="4" w:space="0" w:color="000000"/>
-              <w:bottom w:val="single" w:sz="4" w:space="0" w:color="000000"/>
-            </w:tcBorders>
-          </w:tcPr>
-          <w:p>
-            <w:pPr>
-              <w:pStyle w:val="Tabelindhold"/>
+            <w:tcW w:w="7198" w:type="dxa"/>
+            <w:tcBorders>
+              <w:start w:val="single" w:sz="4" w:space="0" w:color="000000"/>
+              <w:bottom w:val="single" w:sz="4" w:space="0" w:color="000000"/>
+            </w:tcBorders>
+          </w:tcPr>
+          <w:p>
+            <w:pPr>
+              <w:pStyle w:val="Tabelindhold"/>
+              <w:widowControl w:val="false"/>
               <w:bidi w:val="0"/>
               <w:jc w:val="start"/>
               <w:rPr>
@@ -1553,6 +1575,7 @@
           <w:p>
             <w:pPr>
               <w:pStyle w:val="Tabelindhold"/>
+              <w:widowControl w:val="false"/>
               <w:bidi w:val="0"/>
               <w:jc w:val="start"/>
               <w:rPr>
@@ -1604,6 +1627,7 @@
           <w:p>
             <w:pPr>
               <w:pStyle w:val="Tabelindhold"/>
+              <w:widowControl w:val="false"/>
               <w:bidi w:val="0"/>
               <w:jc w:val="start"/>
               <w:rPr>
@@ -1657,6 +1681,7 @@
           <w:p>
             <w:pPr>
               <w:pStyle w:val="Tabelindhold"/>
+              <w:widowControl w:val="false"/>
               <w:bidi w:val="0"/>
               <w:jc w:val="start"/>
               <w:rPr>
@@ -1698,15 +1723,16 @@
         </w:tc>
         <w:tc>
           <w:tcPr>
-            <w:tcW w:w="7199" w:type="dxa"/>
-            <w:tcBorders>
-              <w:start w:val="single" w:sz="4" w:space="0" w:color="000000"/>
-              <w:bottom w:val="single" w:sz="4" w:space="0" w:color="000000"/>
-            </w:tcBorders>
-          </w:tcPr>
-          <w:p>
-            <w:pPr>
-              <w:pStyle w:val="Tabelindhold"/>
+            <w:tcW w:w="7198" w:type="dxa"/>
+            <w:tcBorders>
+              <w:start w:val="single" w:sz="4" w:space="0" w:color="000000"/>
+              <w:bottom w:val="single" w:sz="4" w:space="0" w:color="000000"/>
+            </w:tcBorders>
+          </w:tcPr>
+          <w:p>
+            <w:pPr>
+              <w:pStyle w:val="Tabelindhold"/>
+              <w:widowControl w:val="false"/>
               <w:bidi w:val="0"/>
               <w:jc w:val="start"/>
               <w:rPr>
@@ -1757,6 +1783,7 @@
           <w:p>
             <w:pPr>
               <w:pStyle w:val="Tabelindhold"/>
+              <w:widowControl w:val="false"/>
               <w:bidi w:val="0"/>
               <w:jc w:val="start"/>
               <w:rPr>
@@ -1808,6 +1835,7 @@
           <w:p>
             <w:pPr>
               <w:pStyle w:val="Tabelindhold"/>
+              <w:widowControl w:val="false"/>
               <w:bidi w:val="0"/>
               <w:jc w:val="start"/>
               <w:rPr>
@@ -1861,6 +1889,7 @@
           <w:p>
             <w:pPr>
               <w:pStyle w:val="Tabelindhold"/>
+              <w:widowControl w:val="false"/>
               <w:bidi w:val="0"/>
               <w:jc w:val="start"/>
               <w:rPr>
@@ -1902,15 +1931,16 @@
         </w:tc>
         <w:tc>
           <w:tcPr>
-            <w:tcW w:w="7199" w:type="dxa"/>
-            <w:tcBorders>
-              <w:start w:val="single" w:sz="4" w:space="0" w:color="000000"/>
-              <w:bottom w:val="single" w:sz="4" w:space="0" w:color="000000"/>
-            </w:tcBorders>
-          </w:tcPr>
-          <w:p>
-            <w:pPr>
-              <w:pStyle w:val="Tabelindhold"/>
+            <w:tcW w:w="7198" w:type="dxa"/>
+            <w:tcBorders>
+              <w:start w:val="single" w:sz="4" w:space="0" w:color="000000"/>
+              <w:bottom w:val="single" w:sz="4" w:space="0" w:color="000000"/>
+            </w:tcBorders>
+          </w:tcPr>
+          <w:p>
+            <w:pPr>
+              <w:pStyle w:val="Tabelindhold"/>
+              <w:widowControl w:val="false"/>
               <w:bidi w:val="0"/>
               <w:jc w:val="start"/>
               <w:rPr>
@@ -1961,6 +1991,7 @@
           <w:p>
             <w:pPr>
               <w:pStyle w:val="Tabelindhold"/>
+              <w:widowControl w:val="false"/>
               <w:bidi w:val="0"/>
               <w:jc w:val="start"/>
               <w:rPr>
@@ -2012,6 +2043,7 @@
           <w:p>
             <w:pPr>
               <w:pStyle w:val="Tabelindhold"/>
+              <w:widowControl w:val="false"/>
               <w:bidi w:val="0"/>
               <w:jc w:val="start"/>
               <w:rPr>
@@ -2065,6 +2097,7 @@
           <w:p>
             <w:pPr>
               <w:pStyle w:val="Tabelindhold"/>
+              <w:widowControl w:val="false"/>
               <w:bidi w:val="0"/>
               <w:jc w:val="start"/>
               <w:rPr>
@@ -2106,15 +2139,16 @@
         </w:tc>
         <w:tc>
           <w:tcPr>
-            <w:tcW w:w="7199" w:type="dxa"/>
-            <w:tcBorders>
-              <w:start w:val="single" w:sz="4" w:space="0" w:color="000000"/>
-              <w:bottom w:val="single" w:sz="4" w:space="0" w:color="000000"/>
-            </w:tcBorders>
-          </w:tcPr>
-          <w:p>
-            <w:pPr>
-              <w:pStyle w:val="Tabelindhold"/>
+            <w:tcW w:w="7198" w:type="dxa"/>
+            <w:tcBorders>
+              <w:start w:val="single" w:sz="4" w:space="0" w:color="000000"/>
+              <w:bottom w:val="single" w:sz="4" w:space="0" w:color="000000"/>
+            </w:tcBorders>
+          </w:tcPr>
+          <w:p>
+            <w:pPr>
+              <w:pStyle w:val="Tabelindhold"/>
+              <w:widowControl w:val="false"/>
               <w:bidi w:val="0"/>
               <w:jc w:val="start"/>
               <w:rPr>
@@ -2165,6 +2199,7 @@
           <w:p>
             <w:pPr>
               <w:pStyle w:val="Tabelindhold"/>
+              <w:widowControl w:val="false"/>
               <w:bidi w:val="0"/>
               <w:jc w:val="start"/>
               <w:rPr>
@@ -2216,6 +2251,7 @@
           <w:p>
             <w:pPr>
               <w:pStyle w:val="Tabelindhold"/>
+              <w:widowControl w:val="false"/>
               <w:bidi w:val="0"/>
               <w:jc w:val="start"/>
               <w:rPr>
@@ -2269,6 +2305,7 @@
           <w:p>
             <w:pPr>
               <w:pStyle w:val="Tabelindhold"/>
+              <w:widowControl w:val="false"/>
               <w:bidi w:val="0"/>
               <w:jc w:val="start"/>
               <w:rPr>
@@ -2310,15 +2347,16 @@
         </w:tc>
         <w:tc>
           <w:tcPr>
-            <w:tcW w:w="7199" w:type="dxa"/>
-            <w:tcBorders>
-              <w:start w:val="single" w:sz="4" w:space="0" w:color="000000"/>
-              <w:bottom w:val="single" w:sz="4" w:space="0" w:color="000000"/>
-            </w:tcBorders>
-          </w:tcPr>
-          <w:p>
-            <w:pPr>
-              <w:pStyle w:val="Tabelindhold"/>
+            <w:tcW w:w="7198" w:type="dxa"/>
+            <w:tcBorders>
+              <w:start w:val="single" w:sz="4" w:space="0" w:color="000000"/>
+              <w:bottom w:val="single" w:sz="4" w:space="0" w:color="000000"/>
+            </w:tcBorders>
+          </w:tcPr>
+          <w:p>
+            <w:pPr>
+              <w:pStyle w:val="Tabelindhold"/>
+              <w:widowControl w:val="false"/>
               <w:bidi w:val="0"/>
               <w:jc w:val="start"/>
               <w:rPr>
@@ -2369,6 +2407,7 @@
           <w:p>
             <w:pPr>
               <w:pStyle w:val="Tabelindhold"/>
+              <w:widowControl w:val="false"/>
               <w:bidi w:val="0"/>
               <w:jc w:val="start"/>
               <w:rPr>
@@ -2420,6 +2459,7 @@
           <w:p>
             <w:pPr>
               <w:pStyle w:val="Tabelindhold"/>
+              <w:widowControl w:val="false"/>
               <w:bidi w:val="0"/>
               <w:jc w:val="start"/>
               <w:rPr>
@@ -2473,6 +2513,7 @@
           <w:p>
             <w:pPr>
               <w:pStyle w:val="Tabelindhold"/>
+              <w:widowControl w:val="false"/>
               <w:bidi w:val="0"/>
               <w:jc w:val="start"/>
               <w:rPr>
@@ -2514,15 +2555,16 @@
         </w:tc>
         <w:tc>
           <w:tcPr>
-            <w:tcW w:w="7199" w:type="dxa"/>
-            <w:tcBorders>
-              <w:start w:val="single" w:sz="4" w:space="0" w:color="000000"/>
-              <w:bottom w:val="single" w:sz="4" w:space="0" w:color="000000"/>
-            </w:tcBorders>
-          </w:tcPr>
-          <w:p>
-            <w:pPr>
-              <w:pStyle w:val="Tabelindhold"/>
+            <w:tcW w:w="7198" w:type="dxa"/>
+            <w:tcBorders>
+              <w:start w:val="single" w:sz="4" w:space="0" w:color="000000"/>
+              <w:bottom w:val="single" w:sz="4" w:space="0" w:color="000000"/>
+            </w:tcBorders>
+          </w:tcPr>
+          <w:p>
+            <w:pPr>
+              <w:pStyle w:val="Tabelindhold"/>
+              <w:widowControl w:val="false"/>
               <w:bidi w:val="0"/>
               <w:jc w:val="start"/>
               <w:rPr>
@@ -2573,6 +2615,7 @@
           <w:p>
             <w:pPr>
               <w:pStyle w:val="Tabelindhold"/>
+              <w:widowControl w:val="false"/>
               <w:bidi w:val="0"/>
               <w:jc w:val="start"/>
               <w:rPr>
@@ -2624,6 +2667,7 @@
           <w:p>
             <w:pPr>
               <w:pStyle w:val="Tabelindhold"/>
+              <w:widowControl w:val="false"/>
               <w:bidi w:val="0"/>
               <w:jc w:val="start"/>
               <w:rPr>
@@ -2677,6 +2721,7 @@
           <w:p>
             <w:pPr>
               <w:pStyle w:val="Tabelindhold"/>
+              <w:widowControl w:val="false"/>
               <w:bidi w:val="0"/>
               <w:jc w:val="start"/>
               <w:rPr>
@@ -2718,15 +2763,16 @@
         </w:tc>
         <w:tc>
           <w:tcPr>
-            <w:tcW w:w="7199" w:type="dxa"/>
-            <w:tcBorders>
-              <w:start w:val="single" w:sz="4" w:space="0" w:color="000000"/>
-              <w:bottom w:val="single" w:sz="4" w:space="0" w:color="000000"/>
-            </w:tcBorders>
-          </w:tcPr>
-          <w:p>
-            <w:pPr>
-              <w:pStyle w:val="Tabelindhold"/>
+            <w:tcW w:w="7198" w:type="dxa"/>
+            <w:tcBorders>
+              <w:start w:val="single" w:sz="4" w:space="0" w:color="000000"/>
+              <w:bottom w:val="single" w:sz="4" w:space="0" w:color="000000"/>
+            </w:tcBorders>
+          </w:tcPr>
+          <w:p>
+            <w:pPr>
+              <w:pStyle w:val="Tabelindhold"/>
+              <w:widowControl w:val="false"/>
               <w:bidi w:val="0"/>
               <w:jc w:val="start"/>
               <w:rPr>
@@ -2777,6 +2823,7 @@
           <w:p>
             <w:pPr>
               <w:pStyle w:val="Tabelindhold"/>
+              <w:widowControl w:val="false"/>
               <w:bidi w:val="0"/>
               <w:jc w:val="start"/>
               <w:rPr>
@@ -2828,6 +2875,7 @@
           <w:p>
             <w:pPr>
               <w:pStyle w:val="Tabelindhold"/>
+              <w:widowControl w:val="false"/>
               <w:bidi w:val="0"/>
               <w:jc w:val="start"/>
               <w:rPr>
@@ -2881,6 +2929,7 @@
           <w:p>
             <w:pPr>
               <w:pStyle w:val="Tabelindhold"/>
+              <w:widowControl w:val="false"/>
               <w:bidi w:val="0"/>
               <w:jc w:val="start"/>
               <w:rPr>
@@ -2922,15 +2971,16 @@
         </w:tc>
         <w:tc>
           <w:tcPr>
-            <w:tcW w:w="7199" w:type="dxa"/>
-            <w:tcBorders>
-              <w:start w:val="single" w:sz="4" w:space="0" w:color="000000"/>
-              <w:bottom w:val="single" w:sz="4" w:space="0" w:color="000000"/>
-            </w:tcBorders>
-          </w:tcPr>
-          <w:p>
-            <w:pPr>
-              <w:pStyle w:val="Tabelindhold"/>
+            <w:tcW w:w="7198" w:type="dxa"/>
+            <w:tcBorders>
+              <w:start w:val="single" w:sz="4" w:space="0" w:color="000000"/>
+              <w:bottom w:val="single" w:sz="4" w:space="0" w:color="000000"/>
+            </w:tcBorders>
+          </w:tcPr>
+          <w:p>
+            <w:pPr>
+              <w:pStyle w:val="Tabelindhold"/>
+              <w:widowControl w:val="false"/>
               <w:bidi w:val="0"/>
               <w:jc w:val="start"/>
               <w:rPr>
@@ -2981,6 +3031,7 @@
           <w:p>
             <w:pPr>
               <w:pStyle w:val="Tabelindhold"/>
+              <w:widowControl w:val="false"/>
               <w:bidi w:val="0"/>
               <w:jc w:val="start"/>
               <w:rPr>
@@ -3032,6 +3083,7 @@
           <w:p>
             <w:pPr>
               <w:pStyle w:val="Tabelindhold"/>
+              <w:widowControl w:val="false"/>
               <w:bidi w:val="0"/>
               <w:jc w:val="start"/>
               <w:rPr>
@@ -3085,6 +3137,7 @@
           <w:p>
             <w:pPr>
               <w:pStyle w:val="Tabelindhold"/>
+              <w:widowControl w:val="false"/>
               <w:bidi w:val="0"/>
               <w:jc w:val="start"/>
               <w:rPr>
@@ -3126,15 +3179,16 @@
         </w:tc>
         <w:tc>
           <w:tcPr>
-            <w:tcW w:w="7199" w:type="dxa"/>
-            <w:tcBorders>
-              <w:start w:val="single" w:sz="4" w:space="0" w:color="000000"/>
-              <w:bottom w:val="single" w:sz="4" w:space="0" w:color="000000"/>
-            </w:tcBorders>
-          </w:tcPr>
-          <w:p>
-            <w:pPr>
-              <w:pStyle w:val="Tabelindhold"/>
+            <w:tcW w:w="7198" w:type="dxa"/>
+            <w:tcBorders>
+              <w:start w:val="single" w:sz="4" w:space="0" w:color="000000"/>
+              <w:bottom w:val="single" w:sz="4" w:space="0" w:color="000000"/>
+            </w:tcBorders>
+          </w:tcPr>
+          <w:p>
+            <w:pPr>
+              <w:pStyle w:val="Tabelindhold"/>
+              <w:widowControl w:val="false"/>
               <w:bidi w:val="0"/>
               <w:jc w:val="start"/>
               <w:rPr>
@@ -3185,6 +3239,7 @@
           <w:p>
             <w:pPr>
               <w:pStyle w:val="Tabelindhold"/>
+              <w:widowControl w:val="false"/>
               <w:bidi w:val="0"/>
               <w:jc w:val="start"/>
               <w:rPr>
@@ -3236,6 +3291,7 @@
           <w:p>
             <w:pPr>
               <w:pStyle w:val="Tabelindhold"/>
+              <w:widowControl w:val="false"/>
               <w:bidi w:val="0"/>
               <w:jc w:val="start"/>
               <w:rPr>
@@ -3289,6 +3345,7 @@
           <w:p>
             <w:pPr>
               <w:pStyle w:val="Tabelindhold"/>
+              <w:widowControl w:val="false"/>
               <w:bidi w:val="0"/>
               <w:jc w:val="start"/>
               <w:rPr>
@@ -3330,15 +3387,16 @@
         </w:tc>
         <w:tc>
           <w:tcPr>
-            <w:tcW w:w="7199" w:type="dxa"/>
-            <w:tcBorders>
-              <w:start w:val="single" w:sz="4" w:space="0" w:color="000000"/>
-              <w:bottom w:val="single" w:sz="4" w:space="0" w:color="000000"/>
-            </w:tcBorders>
-          </w:tcPr>
-          <w:p>
-            <w:pPr>
-              <w:pStyle w:val="Tabelindhold"/>
+            <w:tcW w:w="7198" w:type="dxa"/>
+            <w:tcBorders>
+              <w:start w:val="single" w:sz="4" w:space="0" w:color="000000"/>
+              <w:bottom w:val="single" w:sz="4" w:space="0" w:color="000000"/>
+            </w:tcBorders>
+          </w:tcPr>
+          <w:p>
+            <w:pPr>
+              <w:pStyle w:val="Tabelindhold"/>
+              <w:widowControl w:val="false"/>
               <w:bidi w:val="0"/>
               <w:jc w:val="start"/>
               <w:rPr>
@@ -3389,6 +3447,7 @@
           <w:p>
             <w:pPr>
               <w:pStyle w:val="Tabelindhold"/>
+              <w:widowControl w:val="false"/>
               <w:bidi w:val="0"/>
               <w:jc w:val="start"/>
               <w:rPr>
@@ -3440,6 +3499,7 @@
           <w:p>
             <w:pPr>
               <w:pStyle w:val="Tabelindhold"/>
+              <w:widowControl w:val="false"/>
               <w:bidi w:val="0"/>
               <w:jc w:val="start"/>
               <w:rPr>
@@ -3493,6 +3553,7 @@
           <w:p>
             <w:pPr>
               <w:pStyle w:val="Tabelindhold"/>
+              <w:widowControl w:val="false"/>
               <w:bidi w:val="0"/>
               <w:jc w:val="start"/>
               <w:rPr>
@@ -3534,15 +3595,16 @@
         </w:tc>
         <w:tc>
           <w:tcPr>
-            <w:tcW w:w="7199" w:type="dxa"/>
-            <w:tcBorders>
-              <w:start w:val="single" w:sz="4" w:space="0" w:color="000000"/>
-              <w:bottom w:val="single" w:sz="4" w:space="0" w:color="000000"/>
-            </w:tcBorders>
-          </w:tcPr>
-          <w:p>
-            <w:pPr>
-              <w:pStyle w:val="Tabelindhold"/>
+            <w:tcW w:w="7198" w:type="dxa"/>
+            <w:tcBorders>
+              <w:start w:val="single" w:sz="4" w:space="0" w:color="000000"/>
+              <w:bottom w:val="single" w:sz="4" w:space="0" w:color="000000"/>
+            </w:tcBorders>
+          </w:tcPr>
+          <w:p>
+            <w:pPr>
+              <w:pStyle w:val="Tabelindhold"/>
+              <w:widowControl w:val="false"/>
               <w:bidi w:val="0"/>
               <w:jc w:val="start"/>
               <w:rPr>
@@ -3593,6 +3655,7 @@
           <w:p>
             <w:pPr>
               <w:pStyle w:val="Tabelindhold"/>
+              <w:widowControl w:val="false"/>
               <w:bidi w:val="0"/>
               <w:jc w:val="start"/>
               <w:rPr>
@@ -3644,6 +3707,7 @@
           <w:p>
             <w:pPr>
               <w:pStyle w:val="Tabelindhold"/>
+              <w:widowControl w:val="false"/>
               <w:bidi w:val="0"/>
               <w:jc w:val="start"/>
               <w:rPr>
@@ -3697,6 +3761,7 @@
           <w:p>
             <w:pPr>
               <w:pStyle w:val="Tabelindhold"/>
+              <w:widowControl w:val="false"/>
               <w:bidi w:val="0"/>
               <w:jc w:val="start"/>
               <w:rPr>
@@ -3738,15 +3803,16 @@
         </w:tc>
         <w:tc>
           <w:tcPr>
-            <w:tcW w:w="7199" w:type="dxa"/>
-            <w:tcBorders>
-              <w:start w:val="single" w:sz="4" w:space="0" w:color="000000"/>
-              <w:bottom w:val="single" w:sz="4" w:space="0" w:color="000000"/>
-            </w:tcBorders>
-          </w:tcPr>
-          <w:p>
-            <w:pPr>
-              <w:pStyle w:val="Tabelindhold"/>
+            <w:tcW w:w="7198" w:type="dxa"/>
+            <w:tcBorders>
+              <w:start w:val="single" w:sz="4" w:space="0" w:color="000000"/>
+              <w:bottom w:val="single" w:sz="4" w:space="0" w:color="000000"/>
+            </w:tcBorders>
+          </w:tcPr>
+          <w:p>
+            <w:pPr>
+              <w:pStyle w:val="Tabelindhold"/>
+              <w:widowControl w:val="false"/>
               <w:bidi w:val="0"/>
               <w:jc w:val="start"/>
               <w:rPr>
@@ -3797,6 +3863,7 @@
           <w:p>
             <w:pPr>
               <w:pStyle w:val="Tabelindhold"/>
+              <w:widowControl w:val="false"/>
               <w:bidi w:val="0"/>
               <w:jc w:val="start"/>
               <w:rPr>
@@ -3848,6 +3915,7 @@
           <w:p>
             <w:pPr>
               <w:pStyle w:val="Tabelindhold"/>
+              <w:widowControl w:val="false"/>
               <w:bidi w:val="0"/>
               <w:jc w:val="start"/>
               <w:rPr>
@@ -3901,6 +3969,7 @@
           <w:p>
             <w:pPr>
               <w:pStyle w:val="Tabelindhold"/>
+              <w:widowControl w:val="false"/>
               <w:bidi w:val="0"/>
               <w:jc w:val="start"/>
               <w:rPr>
@@ -3942,15 +4011,16 @@
         </w:tc>
         <w:tc>
           <w:tcPr>
-            <w:tcW w:w="7199" w:type="dxa"/>
-            <w:tcBorders>
-              <w:start w:val="single" w:sz="4" w:space="0" w:color="000000"/>
-              <w:bottom w:val="single" w:sz="4" w:space="0" w:color="000000"/>
-            </w:tcBorders>
-          </w:tcPr>
-          <w:p>
-            <w:pPr>
-              <w:pStyle w:val="Tabelindhold"/>
+            <w:tcW w:w="7198" w:type="dxa"/>
+            <w:tcBorders>
+              <w:start w:val="single" w:sz="4" w:space="0" w:color="000000"/>
+              <w:bottom w:val="single" w:sz="4" w:space="0" w:color="000000"/>
+            </w:tcBorders>
+          </w:tcPr>
+          <w:p>
+            <w:pPr>
+              <w:pStyle w:val="Tabelindhold"/>
+              <w:widowControl w:val="false"/>
               <w:bidi w:val="0"/>
               <w:jc w:val="start"/>
               <w:rPr>
@@ -4001,6 +4071,7 @@
           <w:p>
             <w:pPr>
               <w:pStyle w:val="Tabelindhold"/>
+              <w:widowControl w:val="false"/>
               <w:bidi w:val="0"/>
               <w:jc w:val="start"/>
               <w:rPr>
@@ -4052,6 +4123,7 @@
           <w:p>
             <w:pPr>
               <w:pStyle w:val="Tabelindhold"/>
+              <w:widowControl w:val="false"/>
               <w:bidi w:val="0"/>
               <w:jc w:val="start"/>
               <w:rPr>
@@ -4105,6 +4177,7 @@
           <w:p>
             <w:pPr>
               <w:pStyle w:val="Tabelindhold"/>
+              <w:widowControl w:val="false"/>
               <w:bidi w:val="0"/>
               <w:jc w:val="start"/>
               <w:rPr>
@@ -4146,15 +4219,16 @@
         </w:tc>
         <w:tc>
           <w:tcPr>
-            <w:tcW w:w="7199" w:type="dxa"/>
-            <w:tcBorders>
-              <w:start w:val="single" w:sz="4" w:space="0" w:color="000000"/>
-              <w:bottom w:val="single" w:sz="4" w:space="0" w:color="000000"/>
-            </w:tcBorders>
-          </w:tcPr>
-          <w:p>
-            <w:pPr>
-              <w:pStyle w:val="Tabelindhold"/>
+            <w:tcW w:w="7198" w:type="dxa"/>
+            <w:tcBorders>
+              <w:start w:val="single" w:sz="4" w:space="0" w:color="000000"/>
+              <w:bottom w:val="single" w:sz="4" w:space="0" w:color="000000"/>
+            </w:tcBorders>
+          </w:tcPr>
+          <w:p>
+            <w:pPr>
+              <w:pStyle w:val="Tabelindhold"/>
+              <w:widowControl w:val="false"/>
               <w:bidi w:val="0"/>
               <w:jc w:val="start"/>
               <w:rPr>
@@ -4205,6 +4279,7 @@
           <w:p>
             <w:pPr>
               <w:pStyle w:val="Tabelindhold"/>
+              <w:widowControl w:val="false"/>
               <w:bidi w:val="0"/>
               <w:jc w:val="start"/>
               <w:rPr>
@@ -4256,6 +4331,7 @@
           <w:p>
             <w:pPr>
               <w:pStyle w:val="Tabelindhold"/>
+              <w:widowControl w:val="false"/>
               <w:bidi w:val="0"/>
               <w:jc w:val="start"/>
               <w:rPr>
@@ -4309,6 +4385,7 @@
           <w:p>
             <w:pPr>
               <w:pStyle w:val="Tabelindhold"/>
+              <w:widowControl w:val="false"/>
               <w:bidi w:val="0"/>
               <w:jc w:val="start"/>
               <w:rPr>
@@ -4350,15 +4427,16 @@
         </w:tc>
         <w:tc>
           <w:tcPr>
-            <w:tcW w:w="7199" w:type="dxa"/>
-            <w:tcBorders>
-              <w:start w:val="single" w:sz="4" w:space="0" w:color="000000"/>
-              <w:bottom w:val="single" w:sz="4" w:space="0" w:color="000000"/>
-            </w:tcBorders>
-          </w:tcPr>
-          <w:p>
-            <w:pPr>
-              <w:pStyle w:val="Tabelindhold"/>
+            <w:tcW w:w="7198" w:type="dxa"/>
+            <w:tcBorders>
+              <w:start w:val="single" w:sz="4" w:space="0" w:color="000000"/>
+              <w:bottom w:val="single" w:sz="4" w:space="0" w:color="000000"/>
+            </w:tcBorders>
+          </w:tcPr>
+          <w:p>
+            <w:pPr>
+              <w:pStyle w:val="Tabelindhold"/>
+              <w:widowControl w:val="false"/>
               <w:bidi w:val="0"/>
               <w:jc w:val="start"/>
               <w:rPr>
@@ -4409,6 +4487,7 @@
           <w:p>
             <w:pPr>
               <w:pStyle w:val="Tabelindhold"/>
+              <w:widowControl w:val="false"/>
               <w:bidi w:val="0"/>
               <w:jc w:val="start"/>
               <w:rPr>
@@ -4460,6 +4539,7 @@
           <w:p>
             <w:pPr>
               <w:pStyle w:val="Tabelindhold"/>
+              <w:widowControl w:val="false"/>
               <w:bidi w:val="0"/>
               <w:jc w:val="start"/>
               <w:rPr>
@@ -4513,6 +4593,7 @@
           <w:p>
             <w:pPr>
               <w:pStyle w:val="Tabelindhold"/>
+              <w:widowControl w:val="false"/>
               <w:bidi w:val="0"/>
               <w:jc w:val="start"/>
               <w:rPr>
@@ -4554,15 +4635,16 @@
         </w:tc>
         <w:tc>
           <w:tcPr>
-            <w:tcW w:w="7199" w:type="dxa"/>
-            <w:tcBorders>
-              <w:start w:val="single" w:sz="4" w:space="0" w:color="000000"/>
-              <w:bottom w:val="single" w:sz="4" w:space="0" w:color="000000"/>
-            </w:tcBorders>
-          </w:tcPr>
-          <w:p>
-            <w:pPr>
-              <w:pStyle w:val="Tabelindhold"/>
+            <w:tcW w:w="7198" w:type="dxa"/>
+            <w:tcBorders>
+              <w:start w:val="single" w:sz="4" w:space="0" w:color="000000"/>
+              <w:bottom w:val="single" w:sz="4" w:space="0" w:color="000000"/>
+            </w:tcBorders>
+          </w:tcPr>
+          <w:p>
+            <w:pPr>
+              <w:pStyle w:val="Tabelindhold"/>
+              <w:widowControl w:val="false"/>
               <w:bidi w:val="0"/>
               <w:jc w:val="start"/>
               <w:rPr>
@@ -4613,6 +4695,7 @@
           <w:p>
             <w:pPr>
               <w:pStyle w:val="Tabelindhold"/>
+              <w:widowControl w:val="false"/>
               <w:bidi w:val="0"/>
               <w:jc w:val="start"/>
               <w:rPr>
@@ -4664,6 +4747,7 @@
           <w:p>
             <w:pPr>
               <w:pStyle w:val="Tabelindhold"/>
+              <w:widowControl w:val="false"/>
               <w:bidi w:val="0"/>
               <w:jc w:val="start"/>
               <w:rPr>
@@ -4717,6 +4801,7 @@
           <w:p>
             <w:pPr>
               <w:pStyle w:val="Tabelindhold"/>
+              <w:widowControl w:val="false"/>
               <w:bidi w:val="0"/>
               <w:jc w:val="start"/>
               <w:rPr>
@@ -4758,15 +4843,16 @@
         </w:tc>
         <w:tc>
           <w:tcPr>
-            <w:tcW w:w="7199" w:type="dxa"/>
-            <w:tcBorders>
-              <w:start w:val="single" w:sz="4" w:space="0" w:color="000000"/>
-              <w:bottom w:val="single" w:sz="4" w:space="0" w:color="000000"/>
-            </w:tcBorders>
-          </w:tcPr>
-          <w:p>
-            <w:pPr>
-              <w:pStyle w:val="Tabelindhold"/>
+            <w:tcW w:w="7198" w:type="dxa"/>
+            <w:tcBorders>
+              <w:start w:val="single" w:sz="4" w:space="0" w:color="000000"/>
+              <w:bottom w:val="single" w:sz="4" w:space="0" w:color="000000"/>
+            </w:tcBorders>
+          </w:tcPr>
+          <w:p>
+            <w:pPr>
+              <w:pStyle w:val="Tabelindhold"/>
+              <w:widowControl w:val="false"/>
               <w:bidi w:val="0"/>
               <w:jc w:val="start"/>
               <w:rPr>
@@ -4817,6 +4903,7 @@
           <w:p>
             <w:pPr>
               <w:pStyle w:val="Tabelindhold"/>
+              <w:widowControl w:val="false"/>
               <w:bidi w:val="0"/>
               <w:jc w:val="start"/>
               <w:rPr>
@@ -4868,6 +4955,7 @@
           <w:p>
             <w:pPr>
               <w:pStyle w:val="Tabelindhold"/>
+              <w:widowControl w:val="false"/>
               <w:bidi w:val="0"/>
               <w:jc w:val="start"/>
               <w:rPr>
@@ -4921,6 +5009,7 @@
           <w:p>
             <w:pPr>
               <w:pStyle w:val="Tabelindhold"/>
+              <w:widowControl w:val="false"/>
               <w:bidi w:val="0"/>
               <w:jc w:val="start"/>
               <w:rPr>
@@ -4962,15 +5051,16 @@
         </w:tc>
         <w:tc>
           <w:tcPr>
-            <w:tcW w:w="7199" w:type="dxa"/>
-            <w:tcBorders>
-              <w:start w:val="single" w:sz="4" w:space="0" w:color="000000"/>
-              <w:bottom w:val="single" w:sz="4" w:space="0" w:color="000000"/>
-            </w:tcBorders>
-          </w:tcPr>
-          <w:p>
-            <w:pPr>
-              <w:pStyle w:val="Tabelindhold"/>
+            <w:tcW w:w="7198" w:type="dxa"/>
+            <w:tcBorders>
+              <w:start w:val="single" w:sz="4" w:space="0" w:color="000000"/>
+              <w:bottom w:val="single" w:sz="4" w:space="0" w:color="000000"/>
+            </w:tcBorders>
+          </w:tcPr>
+          <w:p>
+            <w:pPr>
+              <w:pStyle w:val="Tabelindhold"/>
+              <w:widowControl w:val="false"/>
               <w:bidi w:val="0"/>
               <w:jc w:val="start"/>
               <w:rPr>
@@ -5021,6 +5111,7 @@
           <w:p>
             <w:pPr>
               <w:pStyle w:val="Tabelindhold"/>
+              <w:widowControl w:val="false"/>
               <w:bidi w:val="0"/>
               <w:jc w:val="start"/>
               <w:rPr>
@@ -5072,6 +5163,7 @@
           <w:p>
             <w:pPr>
               <w:pStyle w:val="Tabelindhold"/>
+              <w:widowControl w:val="false"/>
               <w:bidi w:val="0"/>
               <w:jc w:val="start"/>
               <w:rPr>
@@ -5125,6 +5217,7 @@
           <w:p>
             <w:pPr>
               <w:pStyle w:val="Tabelindhold"/>
+              <w:widowControl w:val="false"/>
               <w:bidi w:val="0"/>
               <w:jc w:val="start"/>
               <w:rPr>
@@ -5166,15 +5259,16 @@
         </w:tc>
         <w:tc>
           <w:tcPr>
-            <w:tcW w:w="7199" w:type="dxa"/>
-            <w:tcBorders>
-              <w:start w:val="single" w:sz="4" w:space="0" w:color="000000"/>
-              <w:bottom w:val="single" w:sz="4" w:space="0" w:color="000000"/>
-            </w:tcBorders>
-          </w:tcPr>
-          <w:p>
-            <w:pPr>
-              <w:pStyle w:val="Tabelindhold"/>
+            <w:tcW w:w="7198" w:type="dxa"/>
+            <w:tcBorders>
+              <w:start w:val="single" w:sz="4" w:space="0" w:color="000000"/>
+              <w:bottom w:val="single" w:sz="4" w:space="0" w:color="000000"/>
+            </w:tcBorders>
+          </w:tcPr>
+          <w:p>
+            <w:pPr>
+              <w:pStyle w:val="Tabelindhold"/>
+              <w:widowControl w:val="false"/>
               <w:bidi w:val="0"/>
               <w:jc w:val="start"/>
               <w:rPr>
@@ -5225,6 +5319,7 @@
           <w:p>
             <w:pPr>
               <w:pStyle w:val="Tabelindhold"/>
+              <w:widowControl w:val="false"/>
               <w:bidi w:val="0"/>
               <w:jc w:val="start"/>
               <w:rPr>
@@ -5276,6 +5371,7 @@
           <w:p>
             <w:pPr>
               <w:pStyle w:val="Tabelindhold"/>
+              <w:widowControl w:val="false"/>
               <w:bidi w:val="0"/>
               <w:jc w:val="start"/>
               <w:rPr>
@@ -5329,6 +5425,7 @@
           <w:p>
             <w:pPr>
               <w:pStyle w:val="Tabelindhold"/>
+              <w:widowControl w:val="false"/>
               <w:bidi w:val="0"/>
               <w:jc w:val="start"/>
               <w:rPr>
@@ -5370,15 +5467,16 @@
         </w:tc>
         <w:tc>
           <w:tcPr>
-            <w:tcW w:w="7199" w:type="dxa"/>
-            <w:tcBorders>
-              <w:start w:val="single" w:sz="4" w:space="0" w:color="000000"/>
-              <w:bottom w:val="single" w:sz="4" w:space="0" w:color="000000"/>
-            </w:tcBorders>
-          </w:tcPr>
-          <w:p>
-            <w:pPr>
-              <w:pStyle w:val="Tabelindhold"/>
+            <w:tcW w:w="7198" w:type="dxa"/>
+            <w:tcBorders>
+              <w:start w:val="single" w:sz="4" w:space="0" w:color="000000"/>
+              <w:bottom w:val="single" w:sz="4" w:space="0" w:color="000000"/>
+            </w:tcBorders>
+          </w:tcPr>
+          <w:p>
+            <w:pPr>
+              <w:pStyle w:val="Tabelindhold"/>
+              <w:widowControl w:val="false"/>
               <w:bidi w:val="0"/>
               <w:jc w:val="start"/>
               <w:rPr>
@@ -5429,6 +5527,7 @@
           <w:p>
             <w:pPr>
               <w:pStyle w:val="Tabelindhold"/>
+              <w:widowControl w:val="false"/>
               <w:bidi w:val="0"/>
               <w:jc w:val="start"/>
               <w:rPr>
@@ -5480,6 +5579,7 @@
           <w:p>
             <w:pPr>
               <w:pStyle w:val="Tabelindhold"/>
+              <w:widowControl w:val="false"/>
               <w:bidi w:val="0"/>
               <w:jc w:val="start"/>
               <w:rPr>
@@ -5533,6 +5633,7 @@
           <w:p>
             <w:pPr>
               <w:pStyle w:val="Tabelindhold"/>
+              <w:widowControl w:val="false"/>
               <w:bidi w:val="0"/>
               <w:jc w:val="start"/>
               <w:rPr>
@@ -5574,68 +5675,52 @@
         </w:tc>
         <w:tc>
           <w:tcPr>
-            <w:tcW w:w="7199" w:type="dxa"/>
-            <w:tcBorders>
-              <w:start w:val="single" w:sz="4" w:space="0" w:color="000000"/>
-              <w:bottom w:val="single" w:sz="4" w:space="0" w:color="000000"/>
-            </w:tcBorders>
-          </w:tcPr>
-          <w:p>
-            <w:pPr>
-              <w:pStyle w:val="Tabelindhold"/>
-              <w:bidi w:val="0"/>
-              <w:jc w:val="start"/>
-              <w:rPr>
-                <w:rFonts w:ascii="Liberation Serif" w:hAnsi="Liberation Serif"/>
-                <w:b w:val="false"/>
-                <w:b w:val="false"/>
-                <w:bCs w:val="false"/>
-                <w:i w:val="false"/>
-                <w:i w:val="false"/>
-                <w:iCs w:val="false"/>
-                <w:strike w:val="false"/>
-                <w:dstrike w:val="false"/>
-                <w:outline w:val="false"/>
-                <w:shadow w:val="false"/>
-                <w:color w:val="000000"/>
-                <w:sz w:val="20"/>
-                <w:szCs w:val="20"/>
-                <w:u w:val="none"/>
-              </w:rPr>
-            </w:pPr>
-            <w:r>
-              <w:rPr>
-                <w:b w:val="false"/>
-                <w:bCs w:val="false"/>
-                <w:i w:val="false"/>
-                <w:iCs w:val="false"/>
-                <w:strike w:val="false"/>
-                <w:dstrike w:val="false"/>
-                <w:outline w:val="false"/>
-                <w:shadow w:val="false"/>
-                <w:color w:val="000000"/>
-                <w:sz w:val="20"/>
-                <w:szCs w:val="20"/>
-                <w:u w:val="none"/>
-              </w:rPr>
-              <w:t xml:space="preserve">Håndtering af lyrik </w:t>
-            </w:r>
-            <w:r>
-              <w:rPr>
-                <w:b w:val="false"/>
-                <w:bCs w:val="false"/>
-                <w:i w:val="false"/>
-                <w:iCs w:val="false"/>
-                <w:strike w:val="false"/>
-                <w:dstrike w:val="false"/>
-                <w:outline w:val="false"/>
-                <w:shadow w:val="false"/>
-                <w:color w:val="000000"/>
-                <w:sz w:val="20"/>
-                <w:szCs w:val="20"/>
-                <w:u w:val="none"/>
-              </w:rPr>
-              <w:t>(Er nævnt ovenfor som SN1.Ø1 og SN1.Ø2)</w:t>
+            <w:tcW w:w="7198" w:type="dxa"/>
+            <w:tcBorders>
+              <w:start w:val="single" w:sz="4" w:space="0" w:color="000000"/>
+              <w:bottom w:val="single" w:sz="4" w:space="0" w:color="000000"/>
+            </w:tcBorders>
+          </w:tcPr>
+          <w:p>
+            <w:pPr>
+              <w:pStyle w:val="Tabelindhold"/>
+              <w:widowControl w:val="false"/>
+              <w:bidi w:val="0"/>
+              <w:jc w:val="start"/>
+              <w:rPr>
+                <w:rFonts w:ascii="Liberation Serif" w:hAnsi="Liberation Serif"/>
+                <w:b w:val="false"/>
+                <w:b w:val="false"/>
+                <w:bCs w:val="false"/>
+                <w:i w:val="false"/>
+                <w:i w:val="false"/>
+                <w:iCs w:val="false"/>
+                <w:strike w:val="false"/>
+                <w:dstrike w:val="false"/>
+                <w:outline w:val="false"/>
+                <w:shadow w:val="false"/>
+                <w:color w:val="000000"/>
+                <w:sz w:val="20"/>
+                <w:szCs w:val="20"/>
+                <w:u w:val="none"/>
+              </w:rPr>
+            </w:pPr>
+            <w:r>
+              <w:rPr>
+                <w:b w:val="false"/>
+                <w:bCs w:val="false"/>
+                <w:i w:val="false"/>
+                <w:iCs w:val="false"/>
+                <w:strike w:val="false"/>
+                <w:dstrike w:val="false"/>
+                <w:outline w:val="false"/>
+                <w:shadow w:val="false"/>
+                <w:color w:val="000000"/>
+                <w:sz w:val="20"/>
+                <w:szCs w:val="20"/>
+                <w:u w:val="none"/>
+              </w:rPr>
+              <w:t>Håndtering af lyrik (Er nævnt ovenfor som SN1.Ø1 og SN1.Ø2)</w:t>
             </w:r>
           </w:p>
         </w:tc>
@@ -5650,6 +5735,7 @@
           <w:p>
             <w:pPr>
               <w:pStyle w:val="Tabelindhold"/>
+              <w:widowControl w:val="false"/>
               <w:bidi w:val="0"/>
               <w:jc w:val="start"/>
               <w:rPr>
@@ -5700,6 +5786,7 @@
           <w:p>
             <w:pPr>
               <w:pStyle w:val="Tabelindhold"/>
+              <w:widowControl w:val="false"/>
               <w:bidi w:val="0"/>
               <w:jc w:val="start"/>
               <w:rPr>
@@ -5752,6 +5839,7 @@
           <w:p>
             <w:pPr>
               <w:pStyle w:val="Tabelindhold"/>
+              <w:widowControl w:val="false"/>
               <w:bidi w:val="0"/>
               <w:jc w:val="start"/>
               <w:rPr>
@@ -5793,15 +5881,16 @@
         </w:tc>
         <w:tc>
           <w:tcPr>
-            <w:tcW w:w="7199" w:type="dxa"/>
-            <w:tcBorders>
-              <w:start w:val="single" w:sz="4" w:space="0" w:color="000000"/>
-              <w:bottom w:val="single" w:sz="4" w:space="0" w:color="000000"/>
-            </w:tcBorders>
-          </w:tcPr>
-          <w:p>
-            <w:pPr>
-              <w:pStyle w:val="Tabelindhold"/>
+            <w:tcW w:w="7198" w:type="dxa"/>
+            <w:tcBorders>
+              <w:start w:val="single" w:sz="4" w:space="0" w:color="000000"/>
+              <w:bottom w:val="single" w:sz="4" w:space="0" w:color="000000"/>
+            </w:tcBorders>
+          </w:tcPr>
+          <w:p>
+            <w:pPr>
+              <w:pStyle w:val="Tabelindhold"/>
+              <w:widowControl w:val="false"/>
               <w:bidi w:val="0"/>
               <w:jc w:val="start"/>
               <w:rPr>
@@ -5852,6 +5941,7 @@
           <w:p>
             <w:pPr>
               <w:pStyle w:val="Tabelindhold"/>
+              <w:widowControl w:val="false"/>
               <w:bidi w:val="0"/>
               <w:jc w:val="start"/>
               <w:rPr>
@@ -5903,6 +5993,7 @@
           <w:p>
             <w:pPr>
               <w:pStyle w:val="Tabelindhold"/>
+              <w:widowControl w:val="false"/>
               <w:bidi w:val="0"/>
               <w:jc w:val="start"/>
               <w:rPr>
@@ -5956,6 +6047,7 @@
           <w:p>
             <w:pPr>
               <w:pStyle w:val="Tabelindhold"/>
+              <w:widowControl w:val="false"/>
               <w:bidi w:val="0"/>
               <w:jc w:val="start"/>
               <w:rPr>
@@ -5997,68 +6089,52 @@
         </w:tc>
         <w:tc>
           <w:tcPr>
-            <w:tcW w:w="7199" w:type="dxa"/>
-            <w:tcBorders>
-              <w:start w:val="single" w:sz="4" w:space="0" w:color="000000"/>
-              <w:bottom w:val="single" w:sz="4" w:space="0" w:color="000000"/>
-            </w:tcBorders>
-          </w:tcPr>
-          <w:p>
-            <w:pPr>
-              <w:pStyle w:val="Tabelindhold"/>
-              <w:bidi w:val="0"/>
-              <w:jc w:val="start"/>
-              <w:rPr>
-                <w:rFonts w:ascii="Liberation Serif" w:hAnsi="Liberation Serif"/>
-                <w:b w:val="false"/>
-                <w:b w:val="false"/>
-                <w:bCs w:val="false"/>
-                <w:i w:val="false"/>
-                <w:i w:val="false"/>
-                <w:iCs w:val="false"/>
-                <w:strike w:val="false"/>
-                <w:dstrike w:val="false"/>
-                <w:outline w:val="false"/>
-                <w:shadow w:val="false"/>
-                <w:color w:val="000000"/>
-                <w:sz w:val="20"/>
-                <w:szCs w:val="20"/>
-                <w:u w:val="none"/>
-              </w:rPr>
-            </w:pPr>
-            <w:r>
-              <w:rPr>
-                <w:b w:val="false"/>
-                <w:bCs w:val="false"/>
-                <w:i w:val="false"/>
-                <w:iCs w:val="false"/>
-                <w:strike w:val="false"/>
-                <w:dstrike w:val="false"/>
-                <w:outline w:val="false"/>
-                <w:shadow w:val="false"/>
-                <w:color w:val="000000"/>
-                <w:sz w:val="20"/>
-                <w:szCs w:val="20"/>
-                <w:u w:val="none"/>
-              </w:rPr>
-              <w:t xml:space="preserve">Håndtering af tabs  </w:t>
-            </w:r>
-            <w:r>
-              <w:rPr>
-                <w:b w:val="false"/>
-                <w:bCs w:val="false"/>
-                <w:i w:val="false"/>
-                <w:iCs w:val="false"/>
-                <w:strike w:val="false"/>
-                <w:dstrike w:val="false"/>
-                <w:outline w:val="false"/>
-                <w:shadow w:val="false"/>
-                <w:color w:val="000000"/>
-                <w:sz w:val="20"/>
-                <w:szCs w:val="20"/>
-                <w:u w:val="none"/>
-              </w:rPr>
-              <w:t>(Er nævnt ovenfor som SN1.Ø4 )</w:t>
+            <w:tcW w:w="7198" w:type="dxa"/>
+            <w:tcBorders>
+              <w:start w:val="single" w:sz="4" w:space="0" w:color="000000"/>
+              <w:bottom w:val="single" w:sz="4" w:space="0" w:color="000000"/>
+            </w:tcBorders>
+          </w:tcPr>
+          <w:p>
+            <w:pPr>
+              <w:pStyle w:val="Tabelindhold"/>
+              <w:widowControl w:val="false"/>
+              <w:bidi w:val="0"/>
+              <w:jc w:val="start"/>
+              <w:rPr>
+                <w:rFonts w:ascii="Liberation Serif" w:hAnsi="Liberation Serif"/>
+                <w:b w:val="false"/>
+                <w:b w:val="false"/>
+                <w:bCs w:val="false"/>
+                <w:i w:val="false"/>
+                <w:i w:val="false"/>
+                <w:iCs w:val="false"/>
+                <w:strike w:val="false"/>
+                <w:dstrike w:val="false"/>
+                <w:outline w:val="false"/>
+                <w:shadow w:val="false"/>
+                <w:color w:val="000000"/>
+                <w:sz w:val="20"/>
+                <w:szCs w:val="20"/>
+                <w:u w:val="none"/>
+              </w:rPr>
+            </w:pPr>
+            <w:r>
+              <w:rPr>
+                <w:b w:val="false"/>
+                <w:bCs w:val="false"/>
+                <w:i w:val="false"/>
+                <w:iCs w:val="false"/>
+                <w:strike w:val="false"/>
+                <w:dstrike w:val="false"/>
+                <w:outline w:val="false"/>
+                <w:shadow w:val="false"/>
+                <w:color w:val="000000"/>
+                <w:sz w:val="20"/>
+                <w:szCs w:val="20"/>
+                <w:u w:val="none"/>
+              </w:rPr>
+              <w:t>Håndtering af tabs  (Er nævnt ovenfor som SN1.Ø4 )</w:t>
             </w:r>
           </w:p>
         </w:tc>
@@ -6073,6 +6149,7 @@
           <w:p>
             <w:pPr>
               <w:pStyle w:val="Tabelindhold"/>
+              <w:widowControl w:val="false"/>
               <w:bidi w:val="0"/>
               <w:jc w:val="start"/>
               <w:rPr>
@@ -6123,6 +6200,7 @@
           <w:p>
             <w:pPr>
               <w:pStyle w:val="Tabelindhold"/>
+              <w:widowControl w:val="false"/>
               <w:bidi w:val="0"/>
               <w:jc w:val="start"/>
               <w:rPr>
@@ -6176,6 +6254,7 @@
           <w:p>
             <w:pPr>
               <w:pStyle w:val="Tabelindhold"/>
+              <w:widowControl w:val="false"/>
               <w:bidi w:val="0"/>
               <w:jc w:val="start"/>
               <w:rPr>
@@ -6217,68 +6296,52 @@
         </w:tc>
         <w:tc>
           <w:tcPr>
-            <w:tcW w:w="7199" w:type="dxa"/>
-            <w:tcBorders>
-              <w:start w:val="single" w:sz="4" w:space="0" w:color="000000"/>
-              <w:bottom w:val="single" w:sz="4" w:space="0" w:color="000000"/>
-            </w:tcBorders>
-          </w:tcPr>
-          <w:p>
-            <w:pPr>
-              <w:pStyle w:val="Tabelindhold"/>
-              <w:bidi w:val="0"/>
-              <w:jc w:val="start"/>
-              <w:rPr>
-                <w:rFonts w:ascii="Liberation Serif" w:hAnsi="Liberation Serif"/>
-                <w:b w:val="false"/>
-                <w:b w:val="false"/>
-                <w:bCs w:val="false"/>
-                <w:i w:val="false"/>
-                <w:i w:val="false"/>
-                <w:iCs w:val="false"/>
-                <w:strike w:val="false"/>
-                <w:dstrike w:val="false"/>
-                <w:outline w:val="false"/>
-                <w:shadow w:val="false"/>
-                <w:color w:val="000000"/>
-                <w:sz w:val="20"/>
-                <w:szCs w:val="20"/>
-                <w:u w:val="none"/>
-              </w:rPr>
-            </w:pPr>
-            <w:r>
-              <w:rPr>
-                <w:b w:val="false"/>
-                <w:bCs w:val="false"/>
-                <w:i w:val="false"/>
-                <w:iCs w:val="false"/>
-                <w:strike w:val="false"/>
-                <w:dstrike w:val="false"/>
-                <w:outline w:val="false"/>
-                <w:shadow w:val="false"/>
-                <w:color w:val="000000"/>
-                <w:sz w:val="20"/>
-                <w:szCs w:val="20"/>
-                <w:u w:val="none"/>
-              </w:rPr>
-              <w:t xml:space="preserve">Implementere feedback på import/export  af brl filer </w:t>
-            </w:r>
-            <w:r>
-              <w:rPr>
-                <w:b w:val="false"/>
-                <w:bCs w:val="false"/>
-                <w:i w:val="false"/>
-                <w:iCs w:val="false"/>
-                <w:strike w:val="false"/>
-                <w:dstrike w:val="false"/>
-                <w:outline w:val="false"/>
-                <w:shadow w:val="false"/>
-                <w:color w:val="000000"/>
-                <w:sz w:val="20"/>
-                <w:szCs w:val="20"/>
-                <w:u w:val="none"/>
-              </w:rPr>
-              <w:t>(Nævnt ovenfor som bl.a SN1.F8)</w:t>
+            <w:tcW w:w="7198" w:type="dxa"/>
+            <w:tcBorders>
+              <w:start w:val="single" w:sz="4" w:space="0" w:color="000000"/>
+              <w:bottom w:val="single" w:sz="4" w:space="0" w:color="000000"/>
+            </w:tcBorders>
+          </w:tcPr>
+          <w:p>
+            <w:pPr>
+              <w:pStyle w:val="Tabelindhold"/>
+              <w:widowControl w:val="false"/>
+              <w:bidi w:val="0"/>
+              <w:jc w:val="start"/>
+              <w:rPr>
+                <w:rFonts w:ascii="Liberation Serif" w:hAnsi="Liberation Serif"/>
+                <w:b w:val="false"/>
+                <w:b w:val="false"/>
+                <w:bCs w:val="false"/>
+                <w:i w:val="false"/>
+                <w:i w:val="false"/>
+                <w:iCs w:val="false"/>
+                <w:strike w:val="false"/>
+                <w:dstrike w:val="false"/>
+                <w:outline w:val="false"/>
+                <w:shadow w:val="false"/>
+                <w:color w:val="000000"/>
+                <w:sz w:val="20"/>
+                <w:szCs w:val="20"/>
+                <w:u w:val="none"/>
+              </w:rPr>
+            </w:pPr>
+            <w:r>
+              <w:rPr>
+                <w:b w:val="false"/>
+                <w:bCs w:val="false"/>
+                <w:i w:val="false"/>
+                <w:iCs w:val="false"/>
+                <w:strike w:val="false"/>
+                <w:dstrike w:val="false"/>
+                <w:outline w:val="false"/>
+                <w:shadow w:val="false"/>
+                <w:color w:val="000000"/>
+                <w:sz w:val="20"/>
+                <w:szCs w:val="20"/>
+                <w:u w:val="none"/>
+              </w:rPr>
+              <w:t>Implementere feedback på import/export  af brl filer (Nævnt ovenfor som bl.a SN1.F8)</w:t>
             </w:r>
           </w:p>
         </w:tc>
@@ -6293,6 +6356,7 @@
           <w:p>
             <w:pPr>
               <w:pStyle w:val="Tabelindhold"/>
+              <w:widowControl w:val="false"/>
               <w:bidi w:val="0"/>
               <w:jc w:val="start"/>
               <w:rPr>
@@ -6343,6 +6407,7 @@
           <w:p>
             <w:pPr>
               <w:pStyle w:val="Tabelindhold"/>
+              <w:widowControl w:val="false"/>
               <w:bidi w:val="0"/>
               <w:jc w:val="start"/>
               <w:rPr>
@@ -6396,6 +6461,7 @@
           <w:p>
             <w:pPr>
               <w:pStyle w:val="Tabelindhold"/>
+              <w:widowControl w:val="false"/>
               <w:bidi w:val="0"/>
               <w:jc w:val="start"/>
               <w:rPr>
@@ -6437,15 +6503,16 @@
         </w:tc>
         <w:tc>
           <w:tcPr>
-            <w:tcW w:w="7199" w:type="dxa"/>
-            <w:tcBorders>
-              <w:start w:val="single" w:sz="4" w:space="0" w:color="000000"/>
-              <w:bottom w:val="single" w:sz="4" w:space="0" w:color="000000"/>
-            </w:tcBorders>
-          </w:tcPr>
-          <w:p>
-            <w:pPr>
-              <w:pStyle w:val="Tabelindhold"/>
+            <w:tcW w:w="7198" w:type="dxa"/>
+            <w:tcBorders>
+              <w:start w:val="single" w:sz="4" w:space="0" w:color="000000"/>
+              <w:bottom w:val="single" w:sz="4" w:space="0" w:color="000000"/>
+            </w:tcBorders>
+          </w:tcPr>
+          <w:p>
+            <w:pPr>
+              <w:pStyle w:val="Tabelindhold"/>
+              <w:widowControl w:val="false"/>
               <w:bidi w:val="0"/>
               <w:jc w:val="start"/>
               <w:rPr>
@@ -6496,6 +6563,7 @@
           <w:p>
             <w:pPr>
               <w:pStyle w:val="Tabelindhold"/>
+              <w:widowControl w:val="false"/>
               <w:bidi w:val="0"/>
               <w:jc w:val="start"/>
               <w:rPr>
@@ -6547,6 +6615,7 @@
           <w:p>
             <w:pPr>
               <w:pStyle w:val="Tabelindhold"/>
+              <w:widowControl w:val="false"/>
               <w:bidi w:val="0"/>
               <w:jc w:val="start"/>
               <w:rPr>
@@ -6600,6 +6669,7 @@
           <w:p>
             <w:pPr>
               <w:pStyle w:val="Tabelindhold"/>
+              <w:widowControl w:val="false"/>
               <w:bidi w:val="0"/>
               <w:jc w:val="start"/>
               <w:rPr>
@@ -6641,68 +6711,52 @@
         </w:tc>
         <w:tc>
           <w:tcPr>
-            <w:tcW w:w="7199" w:type="dxa"/>
-            <w:tcBorders>
-              <w:start w:val="single" w:sz="4" w:space="0" w:color="000000"/>
-              <w:bottom w:val="single" w:sz="4" w:space="0" w:color="000000"/>
-            </w:tcBorders>
-          </w:tcPr>
-          <w:p>
-            <w:pPr>
-              <w:pStyle w:val="Tabelindhold"/>
-              <w:bidi w:val="0"/>
-              <w:jc w:val="start"/>
-              <w:rPr>
-                <w:rFonts w:ascii="Liberation Serif" w:hAnsi="Liberation Serif"/>
-                <w:b w:val="false"/>
-                <w:b w:val="false"/>
-                <w:bCs w:val="false"/>
-                <w:i w:val="false"/>
-                <w:i w:val="false"/>
-                <w:iCs w:val="false"/>
-                <w:strike w:val="false"/>
-                <w:dstrike w:val="false"/>
-                <w:outline w:val="false"/>
-                <w:shadow w:val="false"/>
-                <w:color w:val="000000"/>
-                <w:sz w:val="20"/>
-                <w:szCs w:val="20"/>
-                <w:u w:val="none"/>
-              </w:rPr>
-            </w:pPr>
-            <w:r>
-              <w:rPr>
-                <w:b w:val="false"/>
-                <w:bCs w:val="false"/>
-                <w:i w:val="false"/>
-                <w:iCs w:val="false"/>
-                <w:strike w:val="false"/>
-                <w:dstrike w:val="false"/>
-                <w:outline w:val="false"/>
-                <w:shadow w:val="false"/>
-                <w:color w:val="000000"/>
-                <w:sz w:val="20"/>
-                <w:szCs w:val="20"/>
-                <w:u w:val="none"/>
-              </w:rPr>
-              <w:t xml:space="preserve">Optimering af layout muligheder til papirpunkt </w:t>
-            </w:r>
-            <w:r>
-              <w:rPr>
-                <w:b w:val="false"/>
-                <w:bCs w:val="false"/>
-                <w:i w:val="false"/>
-                <w:iCs w:val="false"/>
-                <w:strike w:val="false"/>
-                <w:dstrike w:val="false"/>
-                <w:outline w:val="false"/>
-                <w:shadow w:val="false"/>
-                <w:color w:val="000000"/>
-                <w:sz w:val="20"/>
-                <w:szCs w:val="20"/>
-                <w:u w:val="none"/>
-              </w:rPr>
-              <w:t>(Er nøvnt ovenfor som SN1.Ø5)</w:t>
+            <w:tcW w:w="7198" w:type="dxa"/>
+            <w:tcBorders>
+              <w:start w:val="single" w:sz="4" w:space="0" w:color="000000"/>
+              <w:bottom w:val="single" w:sz="4" w:space="0" w:color="000000"/>
+            </w:tcBorders>
+          </w:tcPr>
+          <w:p>
+            <w:pPr>
+              <w:pStyle w:val="Tabelindhold"/>
+              <w:widowControl w:val="false"/>
+              <w:bidi w:val="0"/>
+              <w:jc w:val="start"/>
+              <w:rPr>
+                <w:rFonts w:ascii="Liberation Serif" w:hAnsi="Liberation Serif"/>
+                <w:b w:val="false"/>
+                <w:b w:val="false"/>
+                <w:bCs w:val="false"/>
+                <w:i w:val="false"/>
+                <w:i w:val="false"/>
+                <w:iCs w:val="false"/>
+                <w:strike w:val="false"/>
+                <w:dstrike w:val="false"/>
+                <w:outline w:val="false"/>
+                <w:shadow w:val="false"/>
+                <w:color w:val="000000"/>
+                <w:sz w:val="20"/>
+                <w:szCs w:val="20"/>
+                <w:u w:val="none"/>
+              </w:rPr>
+            </w:pPr>
+            <w:r>
+              <w:rPr>
+                <w:b w:val="false"/>
+                <w:bCs w:val="false"/>
+                <w:i w:val="false"/>
+                <w:iCs w:val="false"/>
+                <w:strike w:val="false"/>
+                <w:dstrike w:val="false"/>
+                <w:outline w:val="false"/>
+                <w:shadow w:val="false"/>
+                <w:color w:val="000000"/>
+                <w:sz w:val="20"/>
+                <w:szCs w:val="20"/>
+                <w:u w:val="none"/>
+              </w:rPr>
+              <w:t>Optimering af layout muligheder til papirpunkt (Er nøvnt ovenfor som SN1.Ø5)</w:t>
             </w:r>
           </w:p>
         </w:tc>
@@ -6717,6 +6771,7 @@
           <w:p>
             <w:pPr>
               <w:pStyle w:val="Tabelindhold"/>
+              <w:widowControl w:val="false"/>
               <w:bidi w:val="0"/>
               <w:jc w:val="start"/>
               <w:rPr>
@@ -6767,6 +6822,7 @@
           <w:p>
             <w:pPr>
               <w:pStyle w:val="Tabelindhold"/>
+              <w:widowControl w:val="false"/>
               <w:bidi w:val="0"/>
               <w:jc w:val="start"/>
               <w:rPr>
@@ -6827,6 +6883,7 @@
       <w:pgNumType w:fmt="decimal"/>
       <w:formProt w:val="false"/>
       <w:textDirection w:val="lrTb"/>
+      <w:docGrid w:type="default" w:linePitch="100" w:charSpace="0"/>
     </w:sectPr>
   </w:body>
 </w:document>
@@ -6840,26 +6897,133 @@
       <w:suppressLineNumbers/>
       <w:bidi w:val="0"/>
       <w:jc w:val="start"/>
-      <w:rPr/>
+      <w:rPr>
+        <w:sz w:val="12"/>
+        <w:szCs w:val="12"/>
+      </w:rPr>
     </w:pPr>
     <w:r>
-      <w:rPr/>
+      <w:rPr>
+        <w:sz w:val="12"/>
+        <w:szCs w:val="12"/>
+      </w:rPr>
       <w:fldChar w:fldCharType="begin"/>
     </w:r>
     <w:r>
-      <w:rPr/>
+      <w:rPr>
+        <w:sz w:val="12"/>
+        <w:szCs w:val="12"/>
+      </w:rPr>
       <w:instrText xml:space="preserve"> FILENAME \p </w:instrText>
     </w:r>
     <w:r>
-      <w:rPr/>
+      <w:rPr>
+        <w:sz w:val="12"/>
+        <w:szCs w:val="12"/>
+      </w:rPr>
       <w:fldChar w:fldCharType="separate"/>
     </w:r>
     <w:r>
-      <w:rPr/>
+      <w:rPr>
+        <w:sz w:val="12"/>
+        <w:szCs w:val="12"/>
+      </w:rPr>
       <w:t>C:\Users\holme\Dropbox\Root\Visual Studio 2015\Projects\MusicXmlReaderUI\Documentation\Materiale til brug ved fondsansøgninger\Version 6.0\Tidsestimater.docx</w:t>
     </w:r>
     <w:r>
-      <w:rPr/>
+      <w:rPr>
+        <w:sz w:val="12"/>
+        <w:szCs w:val="12"/>
+      </w:rPr>
+      <w:fldChar w:fldCharType="end"/>
+    </w:r>
+  </w:p>
+  <w:p>
+    <w:pPr>
+      <w:pStyle w:val="Sidefod"/>
+      <w:suppressLineNumbers/>
+      <w:bidi w:val="0"/>
+      <w:jc w:val="start"/>
+      <w:rPr>
+        <w:sz w:val="12"/>
+        <w:szCs w:val="12"/>
+      </w:rPr>
+    </w:pPr>
+    <w:r>
+      <w:rPr>
+        <w:sz w:val="12"/>
+        <w:szCs w:val="12"/>
+      </w:rPr>
+      <w:fldChar w:fldCharType="begin"/>
+    </w:r>
+    <w:r>
+      <w:rPr>
+        <w:sz w:val="12"/>
+        <w:szCs w:val="12"/>
+      </w:rPr>
+      <w:instrText xml:space="preserve"> DATE \@"d'. 'MMMM\ yyyy" </w:instrText>
+    </w:r>
+    <w:r>
+      <w:rPr>
+        <w:sz w:val="12"/>
+        <w:szCs w:val="12"/>
+      </w:rPr>
+      <w:fldChar w:fldCharType="separate"/>
+    </w:r>
+    <w:r>
+      <w:rPr>
+        <w:sz w:val="12"/>
+        <w:szCs w:val="12"/>
+      </w:rPr>
+      <w:t>19. oktober 2023</w:t>
+    </w:r>
+    <w:r>
+      <w:rPr>
+        <w:sz w:val="12"/>
+        <w:szCs w:val="12"/>
+      </w:rPr>
+      <w:fldChar w:fldCharType="end"/>
+    </w:r>
+    <w:r>
+      <w:rPr>
+        <w:sz w:val="12"/>
+        <w:szCs w:val="12"/>
+      </w:rPr>
+      <w:t xml:space="preserve"> </w:t>
+    </w:r>
+    <w:r>
+      <w:rPr>
+        <w:sz w:val="12"/>
+        <w:szCs w:val="12"/>
+      </w:rPr>
+      <w:fldChar w:fldCharType="begin"/>
+    </w:r>
+    <w:r>
+      <w:rPr>
+        <w:sz w:val="12"/>
+        <w:szCs w:val="12"/>
+      </w:rPr>
+      <w:instrText xml:space="preserve"> TIME \@"HH:mm:ss" </w:instrText>
+    </w:r>
+    <w:r>
+      <w:rPr>
+        <w:sz w:val="12"/>
+        <w:szCs w:val="12"/>
+      </w:rPr>
+      <w:fldChar w:fldCharType="separate"/>
+    </w:r>
+    <w:r>
+      <w:rPr>
+        <w:sz w:val="12"/>
+        <w:szCs w:val="12"/>
+      </w:rPr>
+      <w:t>16:49:19</w:t>
+    </w:r>
+    <w:r>
+      <w:rPr>
+        <w:sz w:val="12"/>
+        <w:szCs w:val="12"/>
+      </w:rPr>
       <w:fldChar w:fldCharType="end"/>
     </w:r>
   </w:p>
@@ -6880,7 +7044,6 @@
     </w:rPrDefault>
     <w:pPrDefault>
       <w:pPr>
-        <w:widowControl/>
         <w:suppressAutoHyphens w:val="true"/>
       </w:pPr>
     </w:pPrDefault>
@@ -6890,7 +7053,10 @@
     <w:qFormat/>
     <w:pPr>
       <w:widowControl/>
+      <w:suppressAutoHyphens w:val="true"/>
       <w:bidi w:val="0"/>
+      <w:spacing w:before="0" w:after="0"/>
+      <w:jc w:val="start"/>
     </w:pPr>
     <w:rPr>
       <w:rFonts w:ascii="Liberation Serif" w:hAnsi="Liberation Serif" w:eastAsia="NSimSun" w:cs="Lucida Sans"/>

</xml_diff>

<commit_message>
Updated time estimates for 6.0 / 7,0
</commit_message>
<xml_diff>
--- a/Documentation/Materiale til brug ved fondsansøgninger/Version 6.0/Tidsestimater.docx
+++ b/Documentation/Materiale til brug ved fondsansøgninger/Version 6.0/Tidsestimater.docx
@@ -22,144 +22,182 @@
           <w:sz w:val="40"/>
           <w:szCs w:val="40"/>
         </w:rPr>
-        <w:t xml:space="preserve">Tidsestimater for IBOS Nodelæser Version 6.0 / </w:t>
-      </w:r>
-      <w:r>
-        <w:rPr>
-          <w:b/>
-          <w:bCs/>
-          <w:sz w:val="40"/>
-          <w:szCs w:val="40"/>
-        </w:rPr>
-        <w:t>7.0</w:t>
-      </w:r>
-    </w:p>
-    <w:p>
-      <w:pPr>
-        <w:pStyle w:val="Normal"/>
-        <w:bidi w:val="0"/>
-        <w:jc w:val="start"/>
-        <w:rPr/>
-      </w:pPr>
-      <w:r>
-        <w:rPr/>
-      </w:r>
-    </w:p>
-    <w:p>
-      <w:pPr>
-        <w:pStyle w:val="Normal"/>
-        <w:bidi w:val="0"/>
-        <w:jc w:val="start"/>
-        <w:rPr/>
-      </w:pPr>
-      <w:r>
-        <w:rPr/>
-      </w:r>
-    </w:p>
-    <w:p>
-      <w:pPr>
-        <w:pStyle w:val="Normal"/>
-        <w:bidi w:val="0"/>
-        <w:jc w:val="start"/>
-        <w:rPr/>
-      </w:pPr>
-      <w:r>
-        <w:rPr/>
-        <w:t>Det vedhæftede regneark</w:t>
-      </w:r>
-      <w:r>
-        <w:rPr/>
-        <w:t xml:space="preserve"> indeholder tidsestimater for implementering af ny funktionalitet </w:t>
-      </w:r>
-      <w:r>
-        <w:rPr/>
-        <w:t xml:space="preserve">og fejlrettelser </w:t>
-      </w:r>
-      <w:r>
-        <w:rPr/>
-        <w:t xml:space="preserve">i en eventuel ”IBOS Nodelæser Version 6.0”  </w:t>
-      </w:r>
-      <w:r>
-        <w:rPr/>
-        <w:t>hhv.</w:t>
-      </w:r>
-      <w:r>
-        <w:rPr/>
-        <w:t xml:space="preserve"> ”IBOS Nodelæser Version  </w:t>
-      </w:r>
-      <w:r>
-        <w:rPr/>
-        <w:t>7.0</w:t>
-      </w:r>
+        <w:t>Tidsestimater for IBOS Nodelæser Version 6.0 / 7.0</w:t>
+      </w:r>
+    </w:p>
+    <w:p>
+      <w:pPr>
+        <w:pStyle w:val="Normal"/>
+        <w:bidi w:val="0"/>
+        <w:jc w:val="start"/>
+        <w:rPr/>
+      </w:pPr>
+      <w:r>
+        <w:rPr/>
+      </w:r>
+    </w:p>
+    <w:p>
+      <w:pPr>
+        <w:pStyle w:val="Normal"/>
+        <w:bidi w:val="0"/>
+        <w:jc w:val="start"/>
+        <w:rPr/>
+      </w:pPr>
+      <w:r>
+        <w:rPr/>
+      </w:r>
+    </w:p>
+    <w:p>
+      <w:pPr>
+        <w:pStyle w:val="Normal"/>
+        <w:bidi w:val="0"/>
+        <w:jc w:val="start"/>
+        <w:rPr/>
+      </w:pPr>
+      <w:r>
+        <w:rPr/>
+        <w:t xml:space="preserve">De </w:t>
+      </w:r>
+      <w:r>
+        <w:rPr/>
+        <w:t xml:space="preserve">2 </w:t>
+      </w:r>
+      <w:r>
+        <w:rPr/>
+        <w:t>vedhæftede regneark indeholder tidsestimater for implementering af ny funktionalitet og fejlrettelser i en eventuel ”IBOS Nodelæser Version 6.0”  hhv. ”IBOS Nodelæser Version  7.0”</w:t>
+      </w:r>
+    </w:p>
+    <w:p>
+      <w:pPr>
+        <w:pStyle w:val="Normal"/>
+        <w:bidi w:val="0"/>
+        <w:jc w:val="start"/>
+        <w:rPr/>
+      </w:pPr>
+      <w:r>
+        <w:rPr/>
+      </w:r>
+    </w:p>
+    <w:p>
+      <w:pPr>
+        <w:pStyle w:val="Normal"/>
+        <w:bidi w:val="0"/>
+        <w:jc w:val="start"/>
+        <w:rPr/>
+      </w:pPr>
+      <w:r>
+        <w:rPr/>
+        <w:t>Af praktiske hensyn er estimaterne opdelt svarende til 2 fondsansøgninger på hver ca. 49.000 kr.</w:t>
+      </w:r>
+    </w:p>
+    <w:p>
+      <w:pPr>
+        <w:pStyle w:val="Normal"/>
+        <w:bidi w:val="0"/>
+        <w:jc w:val="start"/>
+        <w:rPr/>
+      </w:pPr>
+      <w:r>
+        <w:rPr/>
+        <w:t xml:space="preserve">modsvarende ca. </w:t>
+      </w:r>
+      <w:r>
+        <w:rPr/>
+        <w:t xml:space="preserve">18 arbejdsdage @ 7,5 timer = </w:t>
+      </w:r>
+      <w:r>
+        <w:rPr/>
+        <w:t xml:space="preserve">135 timer: ”Ansøgning 1” og ”Ansøgning 2”. </w:t>
+      </w:r>
+    </w:p>
+    <w:p>
+      <w:pPr>
+        <w:pStyle w:val="Normal"/>
+        <w:bidi w:val="0"/>
+        <w:jc w:val="start"/>
+        <w:rPr/>
+      </w:pPr>
+      <w:r>
+        <w:rPr/>
+      </w:r>
+    </w:p>
+    <w:p>
+      <w:pPr>
+        <w:pStyle w:val="Normal"/>
+        <w:bidi w:val="0"/>
+        <w:jc w:val="start"/>
+        <w:rPr/>
+      </w:pPr>
       <w:r>
         <w:rPr/>
         <w:t>”</w:t>
       </w:r>
-    </w:p>
-    <w:p>
-      <w:pPr>
-        <w:pStyle w:val="Normal"/>
-        <w:bidi w:val="0"/>
-        <w:jc w:val="start"/>
-        <w:rPr/>
-      </w:pPr>
-      <w:r>
-        <w:rPr/>
-      </w:r>
-    </w:p>
-    <w:p>
-      <w:pPr>
-        <w:pStyle w:val="Normal"/>
-        <w:bidi w:val="0"/>
-        <w:jc w:val="start"/>
-        <w:rPr/>
-      </w:pPr>
-      <w:r>
-        <w:rPr/>
-        <w:t>Af praktiske hensyn er estimaterne opdelt svarende til 2 fondsansøgninger på hver ca. 49.000 kr.</w:t>
-      </w:r>
-    </w:p>
-    <w:p>
-      <w:pPr>
-        <w:pStyle w:val="Normal"/>
-        <w:bidi w:val="0"/>
-        <w:jc w:val="start"/>
-        <w:rPr/>
-      </w:pPr>
-      <w:r>
-        <w:rPr/>
-        <w:t xml:space="preserve">modsvarende ca. 135 arbejdstimer: ”Ansøgning 1” og ”Ansøgning 2”. </w:t>
-      </w:r>
-    </w:p>
-    <w:p>
-      <w:pPr>
-        <w:pStyle w:val="Normal"/>
-        <w:bidi w:val="0"/>
-        <w:jc w:val="start"/>
-        <w:rPr/>
-      </w:pPr>
-      <w:r>
-        <w:rPr/>
-      </w:r>
-    </w:p>
-    <w:p>
-      <w:pPr>
-        <w:pStyle w:val="Normal"/>
-        <w:bidi w:val="0"/>
-        <w:jc w:val="start"/>
-        <w:rPr/>
-      </w:pPr>
-      <w:r>
-        <w:rPr/>
-        <w:t xml:space="preserve">Estimaterne dækker primært </w:t>
-      </w:r>
-      <w:r>
-        <w:rPr/>
-        <w:t>aktiviteter</w:t>
-      </w:r>
-      <w:r>
-        <w:rPr/>
-        <w:t>, som er foreslået i 2 mails fra henholdsvis Susanne Nolsøe og Bo Alstrup i september og oktober 2023.</w:t>
+      <w:r>
+        <w:rPr/>
+        <w:t>Tidsestimater for a</w:t>
+      </w:r>
+      <w:r>
+        <w:rPr/>
+        <w:t>nsøgning 1.</w:t>
+      </w:r>
+      <w:r>
+        <w:rPr/>
+        <w:t>xlsx</w:t>
+      </w:r>
+      <w:r>
+        <w:rPr/>
+        <w:t>” indeholder aktiviteter svarende til en version 6.0.</w:t>
+      </w:r>
+    </w:p>
+    <w:p>
+      <w:pPr>
+        <w:pStyle w:val="Normal"/>
+        <w:bidi w:val="0"/>
+        <w:jc w:val="start"/>
+        <w:rPr/>
+      </w:pPr>
+      <w:r>
+        <w:rPr/>
+        <w:t>”</w:t>
+      </w:r>
+      <w:r>
+        <w:rPr/>
+        <w:t>Tidsestimater for a</w:t>
+      </w:r>
+      <w:r>
+        <w:rPr/>
+        <w:t>nsøgning 2.</w:t>
+      </w:r>
+      <w:r>
+        <w:rPr/>
+        <w:t>xlsx</w:t>
+      </w:r>
+      <w:r>
+        <w:rPr/>
+        <w:t>” indeholder aktiviteter svarende til en version 7.0.</w:t>
+      </w:r>
+    </w:p>
+    <w:p>
+      <w:pPr>
+        <w:pStyle w:val="Normal"/>
+        <w:bidi w:val="0"/>
+        <w:jc w:val="start"/>
+        <w:rPr/>
+      </w:pPr>
+      <w:r>
+        <w:rPr/>
+      </w:r>
+    </w:p>
+    <w:p>
+      <w:pPr>
+        <w:pStyle w:val="Normal"/>
+        <w:bidi w:val="0"/>
+        <w:jc w:val="start"/>
+        <w:rPr/>
+      </w:pPr>
+      <w:r>
+        <w:rPr/>
+        <w:t>Estimaterne dækker primært aktiviteter, som er foreslået i 2 mails fra henholdsvis Susanne Nolsøe og Bo Alstrup i september og oktober 2023.</w:t>
       </w:r>
     </w:p>
     <w:p>
@@ -393,7 +431,21 @@
           <w:b/>
           <w:bCs/>
         </w:rPr>
-        <w:t>Kolonnen Dage benytter følgende forkortelser:</w:t>
+        <w:t xml:space="preserve">Kolonnen </w:t>
+      </w:r>
+      <w:r>
+        <w:rPr>
+          <w:b/>
+          <w:bCs/>
+        </w:rPr>
+        <w:t>Arbejdsd</w:t>
+      </w:r>
+      <w:r>
+        <w:rPr>
+          <w:b/>
+          <w:bCs/>
+        </w:rPr>
+        <w:t>age benytter følgende forkortelser:</w:t>
       </w:r>
     </w:p>
     <w:p>
@@ -407,7 +459,7 @@
         <w:rPr/>
         <w:t xml:space="preserve">Tal </w:t>
         <w:tab/>
-        <w:t>= Estimat i enheden arbejdsdage</w:t>
+        <w:t>= Estimat i enheden arbejdsdage.</w:t>
       </w:r>
     </w:p>
     <w:p>
@@ -421,7 +473,7 @@
         <w:rPr/>
         <w:t xml:space="preserve">? </w:t>
         <w:tab/>
-        <w:t>=  Svær at estimere, men muligvis inden for mulighedernes grænse</w:t>
+        <w:t>=  Svær at estimere, men muligvis inden for mulighedernes grænse.</w:t>
       </w:r>
     </w:p>
     <w:p>
@@ -449,100 +501,29 @@
         <w:rPr/>
         <w:t>X</w:t>
         <w:tab/>
-        <w:t>= Er allerede nævnt andetsteds i tabellen</w:t>
-      </w:r>
-    </w:p>
-    <w:p>
-      <w:pPr>
-        <w:pStyle w:val="Normal"/>
-        <w:bidi w:val="0"/>
-        <w:jc w:val="start"/>
-        <w:rPr/>
-      </w:pPr>
-      <w:r>
-        <w:rPr/>
-      </w:r>
-    </w:p>
-    <w:p>
-      <w:pPr>
-        <w:pStyle w:val="Normal"/>
-        <w:bidi w:val="0"/>
-        <w:jc w:val="start"/>
-        <w:rPr/>
-      </w:pPr>
-      <w:r>
-        <w:rPr/>
-      </w:r>
-    </w:p>
-    <w:p>
-      <w:pPr>
-        <w:pStyle w:val="Normal"/>
-        <w:bidi w:val="0"/>
-        <w:jc w:val="start"/>
-        <w:rPr/>
-      </w:pPr>
-      <w:r>
-        <w:rPr/>
-        <w:t>Regnearket indeholder 3 underark:</w:t>
-      </w:r>
-    </w:p>
-    <w:p>
-      <w:pPr>
-        <w:pStyle w:val="Normal"/>
-        <w:bidi w:val="0"/>
-        <w:jc w:val="start"/>
-        <w:rPr/>
-      </w:pPr>
-      <w:r>
-        <w:rPr/>
-      </w:r>
-    </w:p>
-    <w:p>
-      <w:pPr>
-        <w:pStyle w:val="Normal"/>
-        <w:bidi w:val="0"/>
-        <w:jc w:val="start"/>
-        <w:rPr/>
-      </w:pPr>
-      <w:r>
-        <w:rPr/>
-        <w:t>”</w:t>
-      </w:r>
-      <w:r>
-        <w:rPr/>
-        <w:t>Oversigt” indeholder alle aktiviteter.</w:t>
-      </w:r>
-    </w:p>
-    <w:p>
-      <w:pPr>
-        <w:pStyle w:val="Normal"/>
-        <w:bidi w:val="0"/>
-        <w:jc w:val="start"/>
-        <w:rPr/>
-      </w:pPr>
-      <w:r>
-        <w:rPr/>
-        <w:t>”</w:t>
-      </w:r>
-      <w:r>
-        <w:rPr/>
-        <w:t>Ansøgning 1” indeholder aktiviteter svarende til en version 6.0.</w:t>
-      </w:r>
-    </w:p>
-    <w:p>
-      <w:pPr>
-        <w:pStyle w:val="Normal"/>
-        <w:bidi w:val="0"/>
-        <w:jc w:val="start"/>
-        <w:rPr/>
-      </w:pPr>
-      <w:r>
-        <w:rPr/>
-        <w:t>”</w:t>
-      </w:r>
-      <w:r>
-        <w:rPr/>
-        <w:t>Ansøgning 2” indeholder aktiviteter svarende til en version 7.0.</w:t>
+        <w:t>= Er allerede nævnt andetsteds i tabellen.</w:t>
+      </w:r>
+    </w:p>
+    <w:p>
+      <w:pPr>
+        <w:pStyle w:val="Normal"/>
+        <w:bidi w:val="0"/>
+        <w:jc w:val="start"/>
+        <w:rPr/>
+      </w:pPr>
+      <w:r>
+        <w:rPr/>
+      </w:r>
+    </w:p>
+    <w:p>
+      <w:pPr>
+        <w:pStyle w:val="Normal"/>
+        <w:bidi w:val="0"/>
+        <w:jc w:val="start"/>
+        <w:rPr/>
+      </w:pPr>
+      <w:r>
+        <w:rPr/>
       </w:r>
     </w:p>
     <w:p>
@@ -678,7 +659,7 @@
         <w:sz w:val="12"/>
         <w:szCs w:val="12"/>
       </w:rPr>
-      <w:t>5. december 2023</w:t>
+      <w:t>6. december 2023</w:t>
     </w:r>
     <w:r>
       <w:rPr>
@@ -720,7 +701,7 @@
         <w:sz w:val="12"/>
         <w:szCs w:val="12"/>
       </w:rPr>
-      <w:t>15:26:04</w:t>
+      <w:t>11:42:56</w:t>
     </w:r>
     <w:r>
       <w:rPr>

</xml_diff>